<commit_message>
Paper: heavy vision models section, telemetry, 20 references newest first
Adds Section X (seven pretrained torchvision models on an RTX 4070 Laptop
GPU: inference cost and load, ONNX export accuracy, the wrapped 2D/3D
layouts, photo input, capture on request and per-map contrast, live GPU
fine-tuning with system telemetry, the MobileNetV3 BatchNorm finding,
and where it is useful), with Tables V-VI and Figs. 8-10. Describes
system telemetry in Live Runs, updates test counts, limitations and the
conclusion, and renumbers the later sections.

References grow from 14 to 20 (ResNet, MobileNetV3, R(2+1)D/R3D, ViT,
ConvNeXt, Batch Normalization), ordered newest to oldest with every
in-text citation renumbered; software is dated by the version used.

Co-Authored-By: Claude Opus 5.5 <noreply@anthropic.com>
</commit_message>
<xml_diff>
--- a/paper/NeuroVision_Paper.docx
+++ b/paper/NeuroVision_Paper.docx
@@ -102,7 +102,7 @@
           <w:sz w:val="19"/>
           <w:szCs w:val="19"/>
         </w:rPr>
-        <w:t xml:space="preserve">, an open web platform that combines both experiences on one normalized graph contract. Users can design dense networks backed by seeded PyTorch models and train them in background jobs whose loss, accuracy and activations stream over a replayable WebSocket. They can import trained ONNX models, run them in an isolated, time-limited ONNX Runtime worker, and inspect per-operator outputs, CNN feature maps, convolution filters and attention heads. They can also stream metrics and activations from their own training scripts through a one-file, standard-library client. Three principles govern the design: every value shown is measured rather than animated, every payload is bounded, and every uploaded model is untrusted. Synchronized 2D (SVG) and 3D (instanced WebGL) renderers share a semantic selection state and degrade to aggregate views beyond explicit detail limits. The implementation passes 211 backend and 164 frontend tests. On a CPU laptop, educational networks reach 100% validation accuracy on two-moons and circles in about 2.5 s, and a PyTorch CNN exported to ONNX and run in the worker reproduces PyTorch's outputs to within 5.2 × 10⁻⁸. Attention is recovered by pattern from a real </w:t>
+        <w:t xml:space="preserve">, an open web platform that combines both experiences on one normalized graph contract. Users can design dense networks backed by seeded PyTorch models and train them in background jobs whose loss, accuracy and activations stream over a replayable WebSocket. They can import trained ONNX models, run them in an isolated, time-limited ONNX Runtime worker, and inspect per-operator outputs, CNN feature maps, convolution filters and attention heads. They can also stream metrics and activations from their own training scripts through a one-file, standard-library client. Three principles govern the design: every value shown is measured rather than animated, every payload is bounded, and every uploaded model is untrusted. Synchronized 2D (SVG) and 3D (instanced WebGL) renderers share a semantic selection state and degrade to aggregate views beyond explicit detail limits. The implementation passes 265 backend and 188 frontend tests. On a CPU laptop, educational networks reach 100% validation accuracy on two-moons and circles in about 2.5 s, and a PyTorch CNN exported to ONNX and run in the worker reproduces PyTorch's outputs to within 5.2 × 10⁻⁸. Attention is recovered by pattern from a real </w:t>
       </w:r>
       <w:r>
         <w:rPr>
@@ -117,7 +117,7 @@
           <w:sz w:val="19"/>
           <w:szCs w:val="19"/>
         </w:rPr>
-        <w:t xml:space="preserve"> export, and warm inference inside the worker takes 0.06–0.21 ms on the sample models.</w:t>
+        <w:t xml:space="preserve"> export, and warm inference inside the worker takes 0.06–0.21 ms on the sample models. Seven pretrained vision models, from MobileNetV3 to ViT-B/16 and a 3D video CNN, were exported, viewed and run on a real photo (ONNX matched PyTorch to 2.4 × 10⁻⁵), and fine-tuned on a laptop GPU while the dashboard showed CPU, GPU, memory, ETA and training health live; this surfaced a BatchNorm configuration that cut MobileNetV3's test accuracy from 98.6% to 52.5%.</w:t>
       </w:r>
     </w:p>
     <w:p>
@@ -162,7 +162,7 @@
         <w:jc w:val="both"/>
       </w:pPr>
       <w:r>
-        <w:t xml:space="preserve">Understanding what a neural network computes is central both to learning deep learning and to debugging real models. Visual tools have become a standard aid. Interactive playgrounds let learners change the architecture of a small network and watch it train [1]. Explainers animate the computation of a fixed convolutional network in the browser [2]. Graph viewers such as Netron [3] and TensorBoard's graph visualizer [4] display the operators of production models, and dedicated tools visualize attention in transformers [5].</w:t>
+        <w:t>Understanding what a neural network computes is central both to learning deep learning and to debugging real models. Visual tools have become a standard aid. Interactive playgrounds let learners change the architecture of a small network and watch it train [16]. Explainers animate the computation of a fixed convolutional network in the browser [6]. Graph viewers such as Netron [4] and TensorBoard's graph visualizer [13] display the operators of production models, and dedicated tools visualize attention in transformers [10].</w:t>
       </w:r>
     </w:p>
     <w:p>
@@ -202,7 +202,7 @@
         <w:jc w:val="both"/>
       </w:pPr>
       <w:r>
-        <w:t xml:space="preserve">NeuroVision addresses this gap with one platform and one shared graph representation for two sources of models. Small dense networks are created and trained inside the application; real trained models are imported in the open ONNX format [6]. The same 2D and 3D renderers, inspector and value views serve both. A third path streams training telemetry from the user's own scripts, so real projects can be watched while they train on the user's own hardware.</w:t>
+        <w:t>NeuroVision addresses this gap with one platform and one shared graph representation for two sources of models. Small dense networks are created and trained inside the application; real trained models are imported in the open ONNX format [2]. The same 2D and 3D renderers, inspector and value views serve both. A third path streams training telemetry from the user's own scripts, so real projects can be watched while they train on the user's own hardware.</w:t>
       </w:r>
     </w:p>
     <w:p>
@@ -354,7 +354,7 @@
         <w:t xml:space="preserve">evaluation</w:t>
       </w:r>
       <w:r>
-        <w:t xml:space="preserve"> of correctness, learning behaviour, latency and safety bounds on the implemented system (Section IX).</w:t>
+        <w:t xml:space="preserve"> of correctness, learning behaviour, latency and safety bounds on the implemented system (Section IX), and applies the platform to seven pretrained vision models on a laptop GPU, from MobileNetV3 to ViT-B/16 and a 3D video CNN (Section X).</w:t>
       </w:r>
     </w:p>
     <w:p>
@@ -385,7 +385,7 @@
         <w:jc w:val="both"/>
       </w:pPr>
       <w:r>
-        <w:t xml:space="preserve">TensorFlow Playground [1] popularized direct manipulation of small feed-forward networks on 2D toy datasets, and NeuroVision's Training Lab adopts its moons, circles and spiral tasks. CNN Explainer [2] teaches convolution through an interactive view of one fixed network. Both are effective for teaching, but neither can load a user's model, and both are bound to their own model definitions.</w:t>
+        <w:t>TensorFlow Playground [16] popularized direct manipulation of small feed-forward networks on 2D toy datasets, and NeuroVision's Training Lab adopts its moons, circles and spiral tasks. CNN Explainer [6] teaches convolution through an interactive view of one fixed network. Both are effective for teaching, but neither can load a user's model, and both are bound to their own model definitions.</w:t>
       </w:r>
     </w:p>
     <w:p>
@@ -405,7 +405,7 @@
         <w:jc w:val="both"/>
       </w:pPr>
       <w:r>
-        <w:t xml:space="preserve">Netron [3] renders the operator graphs of ONNX and many other formats and is widely used for inspection, but it does not execute models. TensorBoard [4], [7] and hosted trackers such as Weights &amp; Biases [8] chart training metrics and show dataflow graphs, but they require their own logging stacks and do not connect metrics to an inspectable, runnable graph view.</w:t>
+        <w:t>Netron [4] renders the operator graphs of ONNX and many other formats and is widely used for inspection, but it does not execute models. TensorBoard [13], [17] and hosted trackers such as Weights &amp; Biases [8] chart training metrics and show dataflow graphs, but they require their own logging stacks and do not connect metrics to an inspectable, runnable graph view.</w:t>
       </w:r>
     </w:p>
     <w:p>
@@ -425,7 +425,7 @@
         <w:jc w:val="both"/>
       </w:pPr>
       <w:r>
-        <w:t xml:space="preserve">Visualizing feature maps and filters is a long-standing way to understand CNNs [9], and attention matrices are a common, if debated, window into transformers [5], [10]. Surveys of visual analytics for deep learning [11] call for tools that combine </w:t>
+        <w:t xml:space="preserve">Visualizing feature maps and filters is a long-standing way to understand CNNs [20], and attention matrices are a common, if debated, window into transformers [10], [15]. Surveys of visual analytics for deep learning [9] call for tools that combine </w:t>
       </w:r>
       <w:r>
         <w:rPr>
@@ -565,7 +565,7 @@
                 <w:sz w:val="17"/>
                 <w:szCs w:val="17"/>
               </w:rPr>
-              <w:t xml:space="preserve">Playground [1]</w:t>
+              <w:t>Playground [16]</w:t>
             </w:r>
           </w:p>
         </w:tc>
@@ -599,7 +599,7 @@
                 <w:sz w:val="17"/>
                 <w:szCs w:val="17"/>
               </w:rPr>
-              <w:t xml:space="preserve">CNN Explainer [2]</w:t>
+              <w:t>CNN Explainer [6]</w:t>
             </w:r>
           </w:p>
         </w:tc>
@@ -633,7 +633,7 @@
                 <w:sz w:val="17"/>
                 <w:szCs w:val="17"/>
               </w:rPr>
-              <w:t xml:space="preserve">Netron [3]</w:t>
+              <w:t>Netron [4]</w:t>
             </w:r>
           </w:p>
         </w:tc>
@@ -667,7 +667,7 @@
                 <w:sz w:val="17"/>
                 <w:szCs w:val="17"/>
               </w:rPr>
-              <w:t xml:space="preserve">TensorBoard [4]</w:t>
+              <w:t>TensorBoard [13]</w:t>
             </w:r>
           </w:p>
         </w:tc>
@@ -2245,7 +2245,7 @@
         <w:t xml:space="preserve">frontend</w:t>
       </w:r>
       <w:r>
-        <w:t xml:space="preserve"> is a React and TypeScript single-page application with strict type checking. Shared client state is kept in Zustand, charts use Recharts, and the 3D view uses React Three Fiber on Three.js [12]. The </w:t>
+        <w:t xml:space="preserve"> is a React and TypeScript single-page application with strict type checking. Shared client state is kept in Zustand, charts use Recharts, and the 3D view uses React Three Fiber on Three.js [3]. The </w:t>
       </w:r>
       <w:r>
         <w:rPr>
@@ -2255,7 +2255,7 @@
         <w:t xml:space="preserve">backend</w:t>
       </w:r>
       <w:r>
-        <w:t xml:space="preserve"> is a FastAPI service on Python 3.12 that uses Pydantic for validation, PyTorch [13] for educational networks, and ONNX [6] and ONNX Runtime [14] for imported models. REST endpoints under </w:t>
+        <w:t xml:space="preserve"> is a FastAPI service on Python 3.12 that uses Pydantic for validation, PyTorch [11] for educational networks, and ONNX [2] and ONNX Runtime [1] for imported models. REST endpoints under </w:t>
       </w:r>
       <w:r>
         <w:rPr>
@@ -3811,6 +3811,16 @@
     </w:p>
     <w:p>
       <w:pPr>
+        <w:spacing w:after="80" w:line="264"/>
+        <w:ind w:firstLine="284"/>
+        <w:jc w:val="both"/>
+      </w:pPr>
+      <w:r>
+        <w:t>Every logged step can also carry system statistics measured by the script. The client reports elapsed time, the time since the previous step, throughput when the script passes the number of samples, and an ETA from the rate of progress over the last 20 logged steps; a fractional progress argument keeps the ETA right when a script logs several times per epoch. When psutil and NVML (nvidia-ml-py) are installed, a SystemMonitor adds machine CPU load and RAM, the script's own CPU and resident memory, PyTorch's CUDA allocator, and for each GPU its utilization, memory, temperature and power. The server validates these bounds like any other field, and two rules turn them into alerts: a GPU at most 20% busy for five consecutive steps (the input pipeline is likely the bottleneck) and GPU memory at least 95% full.</w:t>
+      </w:r>
+    </w:p>
+    <w:p>
+      <w:pPr>
         <w:keepNext/>
         <w:spacing w:after="60" w:before="120"/>
         <w:jc w:val="center"/>
@@ -3896,7 +3906,7 @@
         <w:jc w:val="both"/>
       </w:pPr>
       <w:r>
-        <w:t xml:space="preserve">All measurements were taken on a laptop with an Intel Core i9-13980HX, 15.6 GB of RAM and Windows 11. The software was Python 3.12.10, PyTorch 2.14.1 (CPU build), ONNX 1.23.2, ONNX Runtime 1.31.0, FastAPI 0.147.0 and Node.js 24. API latencies were measured in process through FastAPI's test client, so they include validation and serialization but not network transfer.</w:t>
+        <w:t>All measurements were taken on a laptop with an Intel Core i9-13980HX, 15.6 GB of RAM and Windows 11. The software was Python 3.12.10, PyTorch 2.14.1 (CPU build), ONNX 1.23.2, ONNX Runtime 1.31.0, FastAPI 0.147.0 and Node.js 24. API latencies were measured in process through FastAPI's test client, so they include validation and serialization but not network transfer. Section X additionally used an NVIDIA GeForce RTX 4070 Laptop GPU (8 GB) with PyTorch 2.14.1 built for CUDA 13.0.</w:t>
       </w:r>
     </w:p>
     <w:p>
@@ -3923,20 +3933,20 @@
           <w:b/>
           <w:bCs/>
         </w:rPr>
-        <w:t xml:space="preserve">211 tests in 12.7 s</w:t>
-      </w:r>
-      <w:r>
-        <w:t xml:space="preserve">. The tests cover schemas, the error envelope, numerical forward passes and training, determinism, cancellation, ONNX import (malformed, oversized and external-data cases), isolation of the inference worker, timeouts, tensor views and external runs. The frontend suite (Vitest with Testing Library) passes </w:t>
+        <w:t>265 tests in 13.7 s</w:t>
+      </w:r>
+      <w:r>
+        <w:t xml:space="preserve">. The tests cover schemas, the error envelope, numerical forward passes and training, determinism, cancellation, ONNX import (malformed, oversized and external-data cases), isolation of the inference worker, timeouts, tensor views, external runs, training-health rules and system telemetry. The frontend suite (Vitest with Testing Library) passes </w:t>
       </w:r>
       <w:r>
         <w:rPr>
           <w:b/>
           <w:bCs/>
         </w:rPr>
-        <w:t xml:space="preserve">164 tests in 20 files</w:t>
-      </w:r>
-      <w:r>
-        <w:t xml:space="preserve"> in 8.9 s. Strict </w:t>
+        <w:t>188 tests in 22 files</w:t>
+      </w:r>
+      <w:r>
+        <w:t xml:space="preserve"> in 7.1 s. Strict </w:t>
       </w:r>
       <w:r>
         <w:rPr>
@@ -6718,7 +6728,3586 @@
         <w:jc w:val="center"/>
       </w:pPr>
       <w:r>
-        <w:t xml:space="preserve">X. Limitations and Future Work</w:t>
+        <w:t>X. Heavy Vision Models: Measurements, Views and Live GPU Telemetry</w:t>
+      </w:r>
+    </w:p>
+    <w:p>
+      <w:pPr>
+        <w:spacing w:after="80" w:line="264"/>
+        <w:ind w:firstLine="284"/>
+        <w:jc w:val="both"/>
+      </w:pPr>
+      <w:r>
+        <w:t>To check that the platform holds up beyond toy networks, seven pretrained torchvision models were measured and taken through every view: MobileNetV3-Large [12] and EfficientNet-B0, ResNet-18 and ResNet-50 [18], ConvNeXt-Tiny [5], the Vision Transformer ViT-B/16 [7], and the 3D video CNN R3D-18 [14] (input 16 frames of 112 × 112). The scripts and raw results are in the repository's bench/ folder. Throughout the GPU measurements the card drew only 52–55 W at 96–100% utilization and 69–73 °C, so it was power-limited; the GPU figures are a lower bound for this hardware.</w:t>
+      </w:r>
+    </w:p>
+    <w:p>
+      <w:pPr>
+        <w:pStyle w:val="Heading2"/>
+        <w:keepNext/>
+        <w:spacing w:after="60" w:before="140"/>
+      </w:pPr>
+      <w:r>
+        <w:t>A. Inference cost and load</w:t>
+      </w:r>
+    </w:p>
+    <w:p>
+      <w:pPr>
+        <w:spacing w:after="80" w:line="264"/>
+        <w:ind w:firstLine="284"/>
+        <w:jc w:val="both"/>
+      </w:pPr>
+      <w:r>
+        <w:t>Table V lists size, cost and speed. Batch-1 latency on the GPU is dominated by kernel-launch overhead: the 0.22-GMAC MobileNetV3 (6.1 ms) is slower than the 1.8-GMAC ResNet-18 (2.8 ms), while throughput at batch 64 with fp16 autocast follows the arithmetic (3,531 vs 2,694 images/s). During every throughput test the GPU was the bottleneck (96–100% busy, CPU 10–27%). On the CPU, ONNX Runtime ran MobileNet, EfficientNet and the ResNets 5–14× faster than eager PyTorch, but ConvNeXt and ViT only 1.2–1.3× faster and the 3D CNN slower. R3D-18 costs 40.7 GMACs per clip, about ten times ResNet-50, because every convolution also slides over time.</w:t>
+      </w:r>
+    </w:p>
+    <w:p>
+      <w:pPr>
+        <w:keepNext/>
+        <w:spacing w:after="20" w:before="140"/>
+        <w:jc w:val="center"/>
+      </w:pPr>
+      <w:r>
+        <w:rPr>
+          <w:sz w:val="17"/>
+          <w:szCs w:val="17"/>
+        </w:rPr>
+        <w:t>TABLE V</w:t>
+      </w:r>
+    </w:p>
+    <w:p>
+      <w:pPr>
+        <w:keepNext/>
+        <w:spacing w:after="60"/>
+        <w:jc w:val="center"/>
+      </w:pPr>
+      <w:r>
+        <w:rPr>
+          <w:sz w:val="16"/>
+          <w:szCs w:val="16"/>
+        </w:rPr>
+        <w:t>PRETRAINED VISION MODELS ON AN RTX 4070 LAPTOP GPU (BATCH-1 LATENCY FP32; THROUGHPUT FP16)</w:t>
+      </w:r>
+    </w:p>
+    <w:tbl>
+      <w:tblPr>
+        <w:tblW w:type="dxa" w:w="9638"/>
+        <w:jc w:val="center"/>
+        <w:tblBorders>
+          <w:top w:val="single" w:color="auto" w:sz="4"/>
+          <w:left w:val="single" w:color="auto" w:sz="4"/>
+          <w:bottom w:val="single" w:color="auto" w:sz="4"/>
+          <w:right w:val="single" w:color="auto" w:sz="4"/>
+          <w:insideH w:val="single" w:color="auto" w:sz="4"/>
+          <w:insideV w:val="single" w:color="auto" w:sz="4"/>
+        </w:tblBorders>
+      </w:tblPr>
+      <w:tblGrid>
+        <w:gridCol w:w="2700"/>
+        <w:gridCol w:w="1300"/>
+        <w:gridCol w:w="1450"/>
+        <w:gridCol w:w="1150"/>
+        <w:gridCol w:w="1450"/>
+        <w:gridCol w:w="1588"/>
+      </w:tblGrid>
+      <w:tr>
+        <w:trPr>
+          <w:tblHeader/>
+        </w:trPr>
+        <w:tc>
+          <w:tcPr>
+            <w:tcW w:type="dxa" w:w="2700"/>
+            <w:tcBorders>
+              <w:top w:val="single" w:color="000000" w:sz="4"/>
+              <w:left w:val="none" w:color="FFFFFF" w:sz="0"/>
+              <w:bottom w:val="single" w:color="000000" w:sz="4"/>
+              <w:right w:val="none" w:color="FFFFFF" w:sz="0"/>
+            </w:tcBorders>
+            <w:tcMar>
+              <w:top w:type="dxa" w:w="30"/>
+              <w:left w:type="dxa" w:w="70"/>
+              <w:bottom w:type="dxa" w:w="30"/>
+              <w:right w:type="dxa" w:w="70"/>
+            </w:tcMar>
+            <w:vAlign w:val="center"/>
+          </w:tcPr>
+          <w:p>
+            <w:pPr>
+              <w:keepNext/>
+              <w:spacing w:line="230"/>
+              <w:jc w:val="center"/>
+            </w:pPr>
+            <w:r>
+              <w:rPr>
+                <w:b/>
+                <w:bCs/>
+                <w:sz w:val="17"/>
+                <w:szCs w:val="17"/>
+              </w:rPr>
+              <w:t>Model</w:t>
+            </w:r>
+          </w:p>
+        </w:tc>
+        <w:tc>
+          <w:tcPr>
+            <w:tcW w:type="dxa" w:w="1300"/>
+            <w:tcBorders>
+              <w:top w:val="single" w:color="000000" w:sz="4"/>
+              <w:left w:val="none" w:color="FFFFFF" w:sz="0"/>
+              <w:bottom w:val="single" w:color="000000" w:sz="4"/>
+              <w:right w:val="none" w:color="FFFFFF" w:sz="0"/>
+            </w:tcBorders>
+            <w:tcMar>
+              <w:top w:type="dxa" w:w="30"/>
+              <w:left w:type="dxa" w:w="70"/>
+              <w:bottom w:type="dxa" w:w="30"/>
+              <w:right w:type="dxa" w:w="70"/>
+            </w:tcMar>
+            <w:vAlign w:val="center"/>
+          </w:tcPr>
+          <w:p>
+            <w:pPr>
+              <w:keepNext/>
+              <w:spacing w:line="230"/>
+              <w:jc w:val="center"/>
+            </w:pPr>
+            <w:r>
+              <w:rPr>
+                <w:b/>
+                <w:bCs/>
+                <w:sz w:val="17"/>
+                <w:szCs w:val="17"/>
+              </w:rPr>
+              <w:t>Params / GMACs</w:t>
+            </w:r>
+          </w:p>
+        </w:tc>
+        <w:tc>
+          <w:tcPr>
+            <w:tcW w:type="dxa" w:w="1450"/>
+            <w:tcBorders>
+              <w:top w:val="single" w:color="000000" w:sz="4"/>
+              <w:left w:val="none" w:color="FFFFFF" w:sz="0"/>
+              <w:bottom w:val="single" w:color="000000" w:sz="4"/>
+              <w:right w:val="none" w:color="FFFFFF" w:sz="0"/>
+            </w:tcBorders>
+            <w:tcMar>
+              <w:top w:type="dxa" w:w="30"/>
+              <w:left w:type="dxa" w:w="70"/>
+              <w:bottom w:type="dxa" w:w="30"/>
+              <w:right w:type="dxa" w:w="70"/>
+            </w:tcMar>
+            <w:vAlign w:val="center"/>
+          </w:tcPr>
+          <w:p>
+            <w:pPr>
+              <w:keepNext/>
+              <w:spacing w:line="230"/>
+              <w:jc w:val="center"/>
+            </w:pPr>
+            <w:r>
+              <w:rPr>
+                <w:b/>
+                <w:bCs/>
+                <w:sz w:val="17"/>
+                <w:szCs w:val="17"/>
+              </w:rPr>
+              <w:t>GPU b1</w:t>
+            </w:r>
+          </w:p>
+        </w:tc>
+        <w:tc>
+          <w:tcPr>
+            <w:tcW w:type="dxa" w:w="1150"/>
+            <w:tcBorders>
+              <w:top w:val="single" w:color="000000" w:sz="4"/>
+              <w:left w:val="none" w:color="FFFFFF" w:sz="0"/>
+              <w:bottom w:val="single" w:color="000000" w:sz="4"/>
+              <w:right w:val="none" w:color="FFFFFF" w:sz="0"/>
+            </w:tcBorders>
+            <w:tcMar>
+              <w:top w:type="dxa" w:w="30"/>
+              <w:left w:type="dxa" w:w="70"/>
+              <w:bottom w:type="dxa" w:w="30"/>
+              <w:right w:type="dxa" w:w="70"/>
+            </w:tcMar>
+            <w:vAlign w:val="center"/>
+          </w:tcPr>
+          <w:p>
+            <w:pPr>
+              <w:keepNext/>
+              <w:spacing w:line="230"/>
+              <w:jc w:val="center"/>
+            </w:pPr>
+            <w:r>
+              <w:rPr>
+                <w:b/>
+                <w:bCs/>
+                <w:sz w:val="17"/>
+                <w:szCs w:val="17"/>
+              </w:rPr>
+              <w:t>GPU throughput</w:t>
+            </w:r>
+          </w:p>
+        </w:tc>
+        <w:tc>
+          <w:tcPr>
+            <w:tcW w:type="dxa" w:w="1450"/>
+            <w:tcBorders>
+              <w:top w:val="single" w:color="000000" w:sz="4"/>
+              <w:left w:val="none" w:color="FFFFFF" w:sz="0"/>
+              <w:bottom w:val="single" w:color="000000" w:sz="4"/>
+              <w:right w:val="none" w:color="FFFFFF" w:sz="0"/>
+            </w:tcBorders>
+            <w:tcMar>
+              <w:top w:type="dxa" w:w="30"/>
+              <w:left w:type="dxa" w:w="70"/>
+              <w:bottom w:type="dxa" w:w="30"/>
+              <w:right w:type="dxa" w:w="70"/>
+            </w:tcMar>
+            <w:vAlign w:val="center"/>
+          </w:tcPr>
+          <w:p>
+            <w:pPr>
+              <w:keepNext/>
+              <w:spacing w:line="230"/>
+              <w:jc w:val="center"/>
+            </w:pPr>
+            <w:r>
+              <w:rPr>
+                <w:b/>
+                <w:bCs/>
+                <w:sz w:val="17"/>
+                <w:szCs w:val="17"/>
+              </w:rPr>
+              <w:t>ORT CPU b1</w:t>
+            </w:r>
+          </w:p>
+        </w:tc>
+        <w:tc>
+          <w:tcPr>
+            <w:tcW w:type="dxa" w:w="1588"/>
+            <w:tcBorders>
+              <w:top w:val="single" w:color="000000" w:sz="4"/>
+              <w:left w:val="none" w:color="FFFFFF" w:sz="0"/>
+              <w:bottom w:val="single" w:color="000000" w:sz="4"/>
+              <w:right w:val="none" w:color="FFFFFF" w:sz="0"/>
+            </w:tcBorders>
+            <w:tcMar>
+              <w:top w:type="dxa" w:w="30"/>
+              <w:left w:type="dxa" w:w="70"/>
+              <w:bottom w:type="dxa" w:w="30"/>
+              <w:right w:type="dxa" w:w="70"/>
+            </w:tcMar>
+            <w:vAlign w:val="center"/>
+          </w:tcPr>
+          <w:p>
+            <w:pPr>
+              <w:keepNext/>
+              <w:spacing w:line="230"/>
+              <w:jc w:val="center"/>
+            </w:pPr>
+            <w:r>
+              <w:rPr>
+                <w:b/>
+                <w:bCs/>
+                <w:sz w:val="17"/>
+                <w:szCs w:val="17"/>
+              </w:rPr>
+              <w:t>Max |ONNX − PyTorch|</w:t>
+            </w:r>
+          </w:p>
+        </w:tc>
+      </w:tr>
+      <w:tr>
+        <w:trPr>
+          <w:cantSplit/>
+        </w:trPr>
+        <w:tc>
+          <w:tcPr>
+            <w:tcW w:type="dxa" w:w="2700"/>
+            <w:tcBorders>
+              <w:top w:val="none" w:color="FFFFFF" w:sz="0"/>
+              <w:left w:val="none" w:color="FFFFFF" w:sz="0"/>
+              <w:bottom w:val="none" w:color="FFFFFF" w:sz="0"/>
+              <w:right w:val="none" w:color="FFFFFF" w:sz="0"/>
+            </w:tcBorders>
+            <w:tcMar>
+              <w:top w:type="dxa" w:w="30"/>
+              <w:left w:type="dxa" w:w="70"/>
+              <w:bottom w:type="dxa" w:w="30"/>
+              <w:right w:type="dxa" w:w="70"/>
+            </w:tcMar>
+            <w:vAlign w:val="center"/>
+          </w:tcPr>
+          <w:p>
+            <w:pPr>
+              <w:keepNext/>
+              <w:spacing w:line="230"/>
+              <w:jc w:val="left"/>
+            </w:pPr>
+            <w:r>
+              <w:rPr>
+                <w:sz w:val="17"/>
+                <w:szCs w:val="17"/>
+              </w:rPr>
+              <w:t>MobileNetV3-L</w:t>
+            </w:r>
+          </w:p>
+        </w:tc>
+        <w:tc>
+          <w:tcPr>
+            <w:tcW w:type="dxa" w:w="1300"/>
+            <w:tcBorders>
+              <w:top w:val="none" w:color="FFFFFF" w:sz="0"/>
+              <w:left w:val="none" w:color="FFFFFF" w:sz="0"/>
+              <w:bottom w:val="none" w:color="FFFFFF" w:sz="0"/>
+              <w:right w:val="none" w:color="FFFFFF" w:sz="0"/>
+            </w:tcBorders>
+            <w:tcMar>
+              <w:top w:type="dxa" w:w="30"/>
+              <w:left w:type="dxa" w:w="70"/>
+              <w:bottom w:type="dxa" w:w="30"/>
+              <w:right w:type="dxa" w:w="70"/>
+            </w:tcMar>
+            <w:vAlign w:val="center"/>
+          </w:tcPr>
+          <w:p>
+            <w:pPr>
+              <w:keepNext/>
+              <w:spacing w:line="230"/>
+              <w:jc w:val="center"/>
+            </w:pPr>
+            <w:r>
+              <w:rPr>
+                <w:sz w:val="17"/>
+                <w:szCs w:val="17"/>
+              </w:rPr>
+              <w:t>5.5 M / 0.22</w:t>
+            </w:r>
+          </w:p>
+        </w:tc>
+        <w:tc>
+          <w:tcPr>
+            <w:tcW w:type="dxa" w:w="1450"/>
+            <w:tcBorders>
+              <w:top w:val="none" w:color="FFFFFF" w:sz="0"/>
+              <w:left w:val="none" w:color="FFFFFF" w:sz="0"/>
+              <w:bottom w:val="none" w:color="FFFFFF" w:sz="0"/>
+              <w:right w:val="none" w:color="FFFFFF" w:sz="0"/>
+            </w:tcBorders>
+            <w:tcMar>
+              <w:top w:type="dxa" w:w="30"/>
+              <w:left w:type="dxa" w:w="70"/>
+              <w:bottom w:type="dxa" w:w="30"/>
+              <w:right w:type="dxa" w:w="70"/>
+            </w:tcMar>
+            <w:vAlign w:val="center"/>
+          </w:tcPr>
+          <w:p>
+            <w:pPr>
+              <w:keepNext/>
+              <w:spacing w:line="230"/>
+              <w:jc w:val="center"/>
+            </w:pPr>
+            <w:r>
+              <w:rPr>
+                <w:sz w:val="17"/>
+                <w:szCs w:val="17"/>
+              </w:rPr>
+              <w:t>6.1 ms</w:t>
+            </w:r>
+          </w:p>
+        </w:tc>
+        <w:tc>
+          <w:tcPr>
+            <w:tcW w:type="dxa" w:w="1150"/>
+            <w:tcBorders>
+              <w:top w:val="none" w:color="FFFFFF" w:sz="0"/>
+              <w:left w:val="none" w:color="FFFFFF" w:sz="0"/>
+              <w:bottom w:val="none" w:color="FFFFFF" w:sz="0"/>
+              <w:right w:val="none" w:color="FFFFFF" w:sz="0"/>
+            </w:tcBorders>
+            <w:tcMar>
+              <w:top w:type="dxa" w:w="30"/>
+              <w:left w:type="dxa" w:w="70"/>
+              <w:bottom w:type="dxa" w:w="30"/>
+              <w:right w:type="dxa" w:w="70"/>
+            </w:tcMar>
+            <w:vAlign w:val="center"/>
+          </w:tcPr>
+          <w:p>
+            <w:pPr>
+              <w:keepNext/>
+              <w:spacing w:line="230"/>
+              <w:jc w:val="center"/>
+            </w:pPr>
+            <w:r>
+              <w:rPr>
+                <w:sz w:val="17"/>
+                <w:szCs w:val="17"/>
+              </w:rPr>
+              <w:t>3,531 /s</w:t>
+            </w:r>
+          </w:p>
+        </w:tc>
+        <w:tc>
+          <w:tcPr>
+            <w:tcW w:type="dxa" w:w="1450"/>
+            <w:tcBorders>
+              <w:top w:val="none" w:color="FFFFFF" w:sz="0"/>
+              <w:left w:val="none" w:color="FFFFFF" w:sz="0"/>
+              <w:bottom w:val="none" w:color="FFFFFF" w:sz="0"/>
+              <w:right w:val="none" w:color="FFFFFF" w:sz="0"/>
+            </w:tcBorders>
+            <w:tcMar>
+              <w:top w:type="dxa" w:w="30"/>
+              <w:left w:type="dxa" w:w="70"/>
+              <w:bottom w:type="dxa" w:w="30"/>
+              <w:right w:type="dxa" w:w="70"/>
+            </w:tcMar>
+            <w:vAlign w:val="center"/>
+          </w:tcPr>
+          <w:p>
+            <w:pPr>
+              <w:keepNext/>
+              <w:spacing w:line="230"/>
+              <w:jc w:val="center"/>
+            </w:pPr>
+            <w:r>
+              <w:rPr>
+                <w:sz w:val="17"/>
+                <w:szCs w:val="17"/>
+              </w:rPr>
+              <w:t>1.8 ms</w:t>
+            </w:r>
+          </w:p>
+        </w:tc>
+        <w:tc>
+          <w:tcPr>
+            <w:tcW w:type="dxa" w:w="1588"/>
+            <w:tcBorders>
+              <w:top w:val="none" w:color="FFFFFF" w:sz="0"/>
+              <w:left w:val="none" w:color="FFFFFF" w:sz="0"/>
+              <w:bottom w:val="none" w:color="FFFFFF" w:sz="0"/>
+              <w:right w:val="none" w:color="FFFFFF" w:sz="0"/>
+            </w:tcBorders>
+            <w:tcMar>
+              <w:top w:type="dxa" w:w="30"/>
+              <w:left w:type="dxa" w:w="70"/>
+              <w:bottom w:type="dxa" w:w="30"/>
+              <w:right w:type="dxa" w:w="70"/>
+            </w:tcMar>
+            <w:vAlign w:val="center"/>
+          </w:tcPr>
+          <w:p>
+            <w:pPr>
+              <w:keepNext/>
+              <w:spacing w:line="230"/>
+              <w:jc w:val="center"/>
+            </w:pPr>
+            <w:r>
+              <w:rPr>
+                <w:sz w:val="17"/>
+                <w:szCs w:val="17"/>
+              </w:rPr>
+              <w:t>5.8 × 10⁻⁶</w:t>
+            </w:r>
+          </w:p>
+        </w:tc>
+      </w:tr>
+      <w:tr>
+        <w:trPr>
+          <w:cantSplit/>
+        </w:trPr>
+        <w:tc>
+          <w:tcPr>
+            <w:tcW w:type="dxa" w:w="2700"/>
+            <w:tcBorders>
+              <w:top w:val="none" w:color="FFFFFF" w:sz="0"/>
+              <w:left w:val="none" w:color="FFFFFF" w:sz="0"/>
+              <w:bottom w:val="none" w:color="FFFFFF" w:sz="0"/>
+              <w:right w:val="none" w:color="FFFFFF" w:sz="0"/>
+            </w:tcBorders>
+            <w:tcMar>
+              <w:top w:type="dxa" w:w="30"/>
+              <w:left w:type="dxa" w:w="70"/>
+              <w:bottom w:type="dxa" w:w="30"/>
+              <w:right w:type="dxa" w:w="70"/>
+            </w:tcMar>
+            <w:vAlign w:val="center"/>
+          </w:tcPr>
+          <w:p>
+            <w:pPr>
+              <w:keepNext/>
+              <w:spacing w:line="230"/>
+              <w:jc w:val="left"/>
+            </w:pPr>
+            <w:r>
+              <w:rPr>
+                <w:sz w:val="17"/>
+                <w:szCs w:val="17"/>
+              </w:rPr>
+              <w:t>EfficientNet-B0</w:t>
+            </w:r>
+          </w:p>
+        </w:tc>
+        <w:tc>
+          <w:tcPr>
+            <w:tcW w:type="dxa" w:w="1300"/>
+            <w:tcBorders>
+              <w:top w:val="none" w:color="FFFFFF" w:sz="0"/>
+              <w:left w:val="none" w:color="FFFFFF" w:sz="0"/>
+              <w:bottom w:val="none" w:color="FFFFFF" w:sz="0"/>
+              <w:right w:val="none" w:color="FFFFFF" w:sz="0"/>
+            </w:tcBorders>
+            <w:tcMar>
+              <w:top w:type="dxa" w:w="30"/>
+              <w:left w:type="dxa" w:w="70"/>
+              <w:bottom w:type="dxa" w:w="30"/>
+              <w:right w:type="dxa" w:w="70"/>
+            </w:tcMar>
+            <w:vAlign w:val="center"/>
+          </w:tcPr>
+          <w:p>
+            <w:pPr>
+              <w:keepNext/>
+              <w:spacing w:line="230"/>
+              <w:jc w:val="center"/>
+            </w:pPr>
+            <w:r>
+              <w:rPr>
+                <w:sz w:val="17"/>
+                <w:szCs w:val="17"/>
+              </w:rPr>
+              <w:t>5.3 M / 0.39</w:t>
+            </w:r>
+          </w:p>
+        </w:tc>
+        <w:tc>
+          <w:tcPr>
+            <w:tcW w:type="dxa" w:w="1450"/>
+            <w:tcBorders>
+              <w:top w:val="none" w:color="FFFFFF" w:sz="0"/>
+              <w:left w:val="none" w:color="FFFFFF" w:sz="0"/>
+              <w:bottom w:val="none" w:color="FFFFFF" w:sz="0"/>
+              <w:right w:val="none" w:color="FFFFFF" w:sz="0"/>
+            </w:tcBorders>
+            <w:tcMar>
+              <w:top w:type="dxa" w:w="30"/>
+              <w:left w:type="dxa" w:w="70"/>
+              <w:bottom w:type="dxa" w:w="30"/>
+              <w:right w:type="dxa" w:w="70"/>
+            </w:tcMar>
+            <w:vAlign w:val="center"/>
+          </w:tcPr>
+          <w:p>
+            <w:pPr>
+              <w:keepNext/>
+              <w:spacing w:line="230"/>
+              <w:jc w:val="center"/>
+            </w:pPr>
+            <w:r>
+              <w:rPr>
+                <w:sz w:val="17"/>
+                <w:szCs w:val="17"/>
+              </w:rPr>
+              <w:t>9.1 ms</w:t>
+            </w:r>
+          </w:p>
+        </w:tc>
+        <w:tc>
+          <w:tcPr>
+            <w:tcW w:type="dxa" w:w="1150"/>
+            <w:tcBorders>
+              <w:top w:val="none" w:color="FFFFFF" w:sz="0"/>
+              <w:left w:val="none" w:color="FFFFFF" w:sz="0"/>
+              <w:bottom w:val="none" w:color="FFFFFF" w:sz="0"/>
+              <w:right w:val="none" w:color="FFFFFF" w:sz="0"/>
+            </w:tcBorders>
+            <w:tcMar>
+              <w:top w:type="dxa" w:w="30"/>
+              <w:left w:type="dxa" w:w="70"/>
+              <w:bottom w:type="dxa" w:w="30"/>
+              <w:right w:type="dxa" w:w="70"/>
+            </w:tcMar>
+            <w:vAlign w:val="center"/>
+          </w:tcPr>
+          <w:p>
+            <w:pPr>
+              <w:keepNext/>
+              <w:spacing w:line="230"/>
+              <w:jc w:val="center"/>
+            </w:pPr>
+            <w:r>
+              <w:rPr>
+                <w:sz w:val="17"/>
+                <w:szCs w:val="17"/>
+              </w:rPr>
+              <w:t>1,955 /s</w:t>
+            </w:r>
+          </w:p>
+        </w:tc>
+        <w:tc>
+          <w:tcPr>
+            <w:tcW w:type="dxa" w:w="1450"/>
+            <w:tcBorders>
+              <w:top w:val="none" w:color="FFFFFF" w:sz="0"/>
+              <w:left w:val="none" w:color="FFFFFF" w:sz="0"/>
+              <w:bottom w:val="none" w:color="FFFFFF" w:sz="0"/>
+              <w:right w:val="none" w:color="FFFFFF" w:sz="0"/>
+            </w:tcBorders>
+            <w:tcMar>
+              <w:top w:type="dxa" w:w="30"/>
+              <w:left w:type="dxa" w:w="70"/>
+              <w:bottom w:type="dxa" w:w="30"/>
+              <w:right w:type="dxa" w:w="70"/>
+            </w:tcMar>
+            <w:vAlign w:val="center"/>
+          </w:tcPr>
+          <w:p>
+            <w:pPr>
+              <w:keepNext/>
+              <w:spacing w:line="230"/>
+              <w:jc w:val="center"/>
+            </w:pPr>
+            <w:r>
+              <w:rPr>
+                <w:sz w:val="17"/>
+                <w:szCs w:val="17"/>
+              </w:rPr>
+              <w:t>4.8 ms</w:t>
+            </w:r>
+          </w:p>
+        </w:tc>
+        <w:tc>
+          <w:tcPr>
+            <w:tcW w:type="dxa" w:w="1588"/>
+            <w:tcBorders>
+              <w:top w:val="none" w:color="FFFFFF" w:sz="0"/>
+              <w:left w:val="none" w:color="FFFFFF" w:sz="0"/>
+              <w:bottom w:val="none" w:color="FFFFFF" w:sz="0"/>
+              <w:right w:val="none" w:color="FFFFFF" w:sz="0"/>
+            </w:tcBorders>
+            <w:tcMar>
+              <w:top w:type="dxa" w:w="30"/>
+              <w:left w:type="dxa" w:w="70"/>
+              <w:bottom w:type="dxa" w:w="30"/>
+              <w:right w:type="dxa" w:w="70"/>
+            </w:tcMar>
+            <w:vAlign w:val="center"/>
+          </w:tcPr>
+          <w:p>
+            <w:pPr>
+              <w:keepNext/>
+              <w:spacing w:line="230"/>
+              <w:jc w:val="center"/>
+            </w:pPr>
+            <w:r>
+              <w:rPr>
+                <w:sz w:val="17"/>
+                <w:szCs w:val="17"/>
+              </w:rPr>
+              <w:t>9.5 × 10⁻⁶</w:t>
+            </w:r>
+          </w:p>
+        </w:tc>
+      </w:tr>
+      <w:tr>
+        <w:trPr>
+          <w:cantSplit/>
+        </w:trPr>
+        <w:tc>
+          <w:tcPr>
+            <w:tcW w:type="dxa" w:w="2700"/>
+            <w:tcBorders>
+              <w:top w:val="none" w:color="FFFFFF" w:sz="0"/>
+              <w:left w:val="none" w:color="FFFFFF" w:sz="0"/>
+              <w:bottom w:val="none" w:color="FFFFFF" w:sz="0"/>
+              <w:right w:val="none" w:color="FFFFFF" w:sz="0"/>
+            </w:tcBorders>
+            <w:tcMar>
+              <w:top w:type="dxa" w:w="30"/>
+              <w:left w:type="dxa" w:w="70"/>
+              <w:bottom w:type="dxa" w:w="30"/>
+              <w:right w:type="dxa" w:w="70"/>
+            </w:tcMar>
+            <w:vAlign w:val="center"/>
+          </w:tcPr>
+          <w:p>
+            <w:pPr>
+              <w:keepNext/>
+              <w:spacing w:line="230"/>
+              <w:jc w:val="left"/>
+            </w:pPr>
+            <w:r>
+              <w:rPr>
+                <w:sz w:val="17"/>
+                <w:szCs w:val="17"/>
+              </w:rPr>
+              <w:t>ResNet-18</w:t>
+            </w:r>
+          </w:p>
+        </w:tc>
+        <w:tc>
+          <w:tcPr>
+            <w:tcW w:type="dxa" w:w="1300"/>
+            <w:tcBorders>
+              <w:top w:val="none" w:color="FFFFFF" w:sz="0"/>
+              <w:left w:val="none" w:color="FFFFFF" w:sz="0"/>
+              <w:bottom w:val="none" w:color="FFFFFF" w:sz="0"/>
+              <w:right w:val="none" w:color="FFFFFF" w:sz="0"/>
+            </w:tcBorders>
+            <w:tcMar>
+              <w:top w:type="dxa" w:w="30"/>
+              <w:left w:type="dxa" w:w="70"/>
+              <w:bottom w:type="dxa" w:w="30"/>
+              <w:right w:type="dxa" w:w="70"/>
+            </w:tcMar>
+            <w:vAlign w:val="center"/>
+          </w:tcPr>
+          <w:p>
+            <w:pPr>
+              <w:keepNext/>
+              <w:spacing w:line="230"/>
+              <w:jc w:val="center"/>
+            </w:pPr>
+            <w:r>
+              <w:rPr>
+                <w:sz w:val="17"/>
+                <w:szCs w:val="17"/>
+              </w:rPr>
+              <w:t>11.7 M / 1.81</w:t>
+            </w:r>
+          </w:p>
+        </w:tc>
+        <w:tc>
+          <w:tcPr>
+            <w:tcW w:type="dxa" w:w="1450"/>
+            <w:tcBorders>
+              <w:top w:val="none" w:color="FFFFFF" w:sz="0"/>
+              <w:left w:val="none" w:color="FFFFFF" w:sz="0"/>
+              <w:bottom w:val="none" w:color="FFFFFF" w:sz="0"/>
+              <w:right w:val="none" w:color="FFFFFF" w:sz="0"/>
+            </w:tcBorders>
+            <w:tcMar>
+              <w:top w:type="dxa" w:w="30"/>
+              <w:left w:type="dxa" w:w="70"/>
+              <w:bottom w:type="dxa" w:w="30"/>
+              <w:right w:type="dxa" w:w="70"/>
+            </w:tcMar>
+            <w:vAlign w:val="center"/>
+          </w:tcPr>
+          <w:p>
+            <w:pPr>
+              <w:keepNext/>
+              <w:spacing w:line="230"/>
+              <w:jc w:val="center"/>
+            </w:pPr>
+            <w:r>
+              <w:rPr>
+                <w:sz w:val="17"/>
+                <w:szCs w:val="17"/>
+              </w:rPr>
+              <w:t>2.8 ms</w:t>
+            </w:r>
+          </w:p>
+        </w:tc>
+        <w:tc>
+          <w:tcPr>
+            <w:tcW w:type="dxa" w:w="1150"/>
+            <w:tcBorders>
+              <w:top w:val="none" w:color="FFFFFF" w:sz="0"/>
+              <w:left w:val="none" w:color="FFFFFF" w:sz="0"/>
+              <w:bottom w:val="none" w:color="FFFFFF" w:sz="0"/>
+              <w:right w:val="none" w:color="FFFFFF" w:sz="0"/>
+            </w:tcBorders>
+            <w:tcMar>
+              <w:top w:type="dxa" w:w="30"/>
+              <w:left w:type="dxa" w:w="70"/>
+              <w:bottom w:type="dxa" w:w="30"/>
+              <w:right w:type="dxa" w:w="70"/>
+            </w:tcMar>
+            <w:vAlign w:val="center"/>
+          </w:tcPr>
+          <w:p>
+            <w:pPr>
+              <w:keepNext/>
+              <w:spacing w:line="230"/>
+              <w:jc w:val="center"/>
+            </w:pPr>
+            <w:r>
+              <w:rPr>
+                <w:sz w:val="17"/>
+                <w:szCs w:val="17"/>
+              </w:rPr>
+              <w:t>2,694 /s</w:t>
+            </w:r>
+          </w:p>
+        </w:tc>
+        <w:tc>
+          <w:tcPr>
+            <w:tcW w:type="dxa" w:w="1450"/>
+            <w:tcBorders>
+              <w:top w:val="none" w:color="FFFFFF" w:sz="0"/>
+              <w:left w:val="none" w:color="FFFFFF" w:sz="0"/>
+              <w:bottom w:val="none" w:color="FFFFFF" w:sz="0"/>
+              <w:right w:val="none" w:color="FFFFFF" w:sz="0"/>
+            </w:tcBorders>
+            <w:tcMar>
+              <w:top w:type="dxa" w:w="30"/>
+              <w:left w:type="dxa" w:w="70"/>
+              <w:bottom w:type="dxa" w:w="30"/>
+              <w:right w:type="dxa" w:w="70"/>
+            </w:tcMar>
+            <w:vAlign w:val="center"/>
+          </w:tcPr>
+          <w:p>
+            <w:pPr>
+              <w:keepNext/>
+              <w:spacing w:line="230"/>
+              <w:jc w:val="center"/>
+            </w:pPr>
+            <w:r>
+              <w:rPr>
+                <w:sz w:val="17"/>
+                <w:szCs w:val="17"/>
+              </w:rPr>
+              <w:t>5.3 ms</w:t>
+            </w:r>
+          </w:p>
+        </w:tc>
+        <w:tc>
+          <w:tcPr>
+            <w:tcW w:type="dxa" w:w="1588"/>
+            <w:tcBorders>
+              <w:top w:val="none" w:color="FFFFFF" w:sz="0"/>
+              <w:left w:val="none" w:color="FFFFFF" w:sz="0"/>
+              <w:bottom w:val="none" w:color="FFFFFF" w:sz="0"/>
+              <w:right w:val="none" w:color="FFFFFF" w:sz="0"/>
+            </w:tcBorders>
+            <w:tcMar>
+              <w:top w:type="dxa" w:w="30"/>
+              <w:left w:type="dxa" w:w="70"/>
+              <w:bottom w:type="dxa" w:w="30"/>
+              <w:right w:type="dxa" w:w="70"/>
+            </w:tcMar>
+            <w:vAlign w:val="center"/>
+          </w:tcPr>
+          <w:p>
+            <w:pPr>
+              <w:keepNext/>
+              <w:spacing w:line="230"/>
+              <w:jc w:val="center"/>
+            </w:pPr>
+            <w:r>
+              <w:rPr>
+                <w:sz w:val="17"/>
+                <w:szCs w:val="17"/>
+              </w:rPr>
+              <w:t>6.7 × 10⁻⁶</w:t>
+            </w:r>
+          </w:p>
+        </w:tc>
+      </w:tr>
+      <w:tr>
+        <w:trPr>
+          <w:cantSplit/>
+        </w:trPr>
+        <w:tc>
+          <w:tcPr>
+            <w:tcW w:type="dxa" w:w="2700"/>
+            <w:tcBorders>
+              <w:top w:val="none" w:color="FFFFFF" w:sz="0"/>
+              <w:left w:val="none" w:color="FFFFFF" w:sz="0"/>
+              <w:bottom w:val="none" w:color="FFFFFF" w:sz="0"/>
+              <w:right w:val="none" w:color="FFFFFF" w:sz="0"/>
+            </w:tcBorders>
+            <w:tcMar>
+              <w:top w:type="dxa" w:w="30"/>
+              <w:left w:type="dxa" w:w="70"/>
+              <w:bottom w:type="dxa" w:w="30"/>
+              <w:right w:type="dxa" w:w="70"/>
+            </w:tcMar>
+            <w:vAlign w:val="center"/>
+          </w:tcPr>
+          <w:p>
+            <w:pPr>
+              <w:keepNext/>
+              <w:spacing w:line="230"/>
+              <w:jc w:val="left"/>
+            </w:pPr>
+            <w:r>
+              <w:rPr>
+                <w:sz w:val="17"/>
+                <w:szCs w:val="17"/>
+              </w:rPr>
+              <w:t>ResNet-50</w:t>
+            </w:r>
+          </w:p>
+        </w:tc>
+        <w:tc>
+          <w:tcPr>
+            <w:tcW w:type="dxa" w:w="1300"/>
+            <w:tcBorders>
+              <w:top w:val="none" w:color="FFFFFF" w:sz="0"/>
+              <w:left w:val="none" w:color="FFFFFF" w:sz="0"/>
+              <w:bottom w:val="none" w:color="FFFFFF" w:sz="0"/>
+              <w:right w:val="none" w:color="FFFFFF" w:sz="0"/>
+            </w:tcBorders>
+            <w:tcMar>
+              <w:top w:type="dxa" w:w="30"/>
+              <w:left w:type="dxa" w:w="70"/>
+              <w:bottom w:type="dxa" w:w="30"/>
+              <w:right w:type="dxa" w:w="70"/>
+            </w:tcMar>
+            <w:vAlign w:val="center"/>
+          </w:tcPr>
+          <w:p>
+            <w:pPr>
+              <w:keepNext/>
+              <w:spacing w:line="230"/>
+              <w:jc w:val="center"/>
+            </w:pPr>
+            <w:r>
+              <w:rPr>
+                <w:sz w:val="17"/>
+                <w:szCs w:val="17"/>
+              </w:rPr>
+              <w:t>25.6 M / 4.09</w:t>
+            </w:r>
+          </w:p>
+        </w:tc>
+        <w:tc>
+          <w:tcPr>
+            <w:tcW w:type="dxa" w:w="1450"/>
+            <w:tcBorders>
+              <w:top w:val="none" w:color="FFFFFF" w:sz="0"/>
+              <w:left w:val="none" w:color="FFFFFF" w:sz="0"/>
+              <w:bottom w:val="none" w:color="FFFFFF" w:sz="0"/>
+              <w:right w:val="none" w:color="FFFFFF" w:sz="0"/>
+            </w:tcBorders>
+            <w:tcMar>
+              <w:top w:type="dxa" w:w="30"/>
+              <w:left w:type="dxa" w:w="70"/>
+              <w:bottom w:type="dxa" w:w="30"/>
+              <w:right w:type="dxa" w:w="70"/>
+            </w:tcMar>
+            <w:vAlign w:val="center"/>
+          </w:tcPr>
+          <w:p>
+            <w:pPr>
+              <w:keepNext/>
+              <w:spacing w:line="230"/>
+              <w:jc w:val="center"/>
+            </w:pPr>
+            <w:r>
+              <w:rPr>
+                <w:sz w:val="17"/>
+                <w:szCs w:val="17"/>
+              </w:rPr>
+              <w:t>6.5 ms</w:t>
+            </w:r>
+          </w:p>
+        </w:tc>
+        <w:tc>
+          <w:tcPr>
+            <w:tcW w:type="dxa" w:w="1150"/>
+            <w:tcBorders>
+              <w:top w:val="none" w:color="FFFFFF" w:sz="0"/>
+              <w:left w:val="none" w:color="FFFFFF" w:sz="0"/>
+              <w:bottom w:val="none" w:color="FFFFFF" w:sz="0"/>
+              <w:right w:val="none" w:color="FFFFFF" w:sz="0"/>
+            </w:tcBorders>
+            <w:tcMar>
+              <w:top w:type="dxa" w:w="30"/>
+              <w:left w:type="dxa" w:w="70"/>
+              <w:bottom w:type="dxa" w:w="30"/>
+              <w:right w:type="dxa" w:w="70"/>
+            </w:tcMar>
+            <w:vAlign w:val="center"/>
+          </w:tcPr>
+          <w:p>
+            <w:pPr>
+              <w:keepNext/>
+              <w:spacing w:line="230"/>
+              <w:jc w:val="center"/>
+            </w:pPr>
+            <w:r>
+              <w:rPr>
+                <w:sz w:val="17"/>
+                <w:szCs w:val="17"/>
+              </w:rPr>
+              <w:t>869 /s</w:t>
+            </w:r>
+          </w:p>
+        </w:tc>
+        <w:tc>
+          <w:tcPr>
+            <w:tcW w:type="dxa" w:w="1450"/>
+            <w:tcBorders>
+              <w:top w:val="none" w:color="FFFFFF" w:sz="0"/>
+              <w:left w:val="none" w:color="FFFFFF" w:sz="0"/>
+              <w:bottom w:val="none" w:color="FFFFFF" w:sz="0"/>
+              <w:right w:val="none" w:color="FFFFFF" w:sz="0"/>
+            </w:tcBorders>
+            <w:tcMar>
+              <w:top w:type="dxa" w:w="30"/>
+              <w:left w:type="dxa" w:w="70"/>
+              <w:bottom w:type="dxa" w:w="30"/>
+              <w:right w:type="dxa" w:w="70"/>
+            </w:tcMar>
+            <w:vAlign w:val="center"/>
+          </w:tcPr>
+          <w:p>
+            <w:pPr>
+              <w:keepNext/>
+              <w:spacing w:line="230"/>
+              <w:jc w:val="center"/>
+            </w:pPr>
+            <w:r>
+              <w:rPr>
+                <w:sz w:val="17"/>
+                <w:szCs w:val="17"/>
+              </w:rPr>
+              <w:t>12.0 ms</w:t>
+            </w:r>
+          </w:p>
+        </w:tc>
+        <w:tc>
+          <w:tcPr>
+            <w:tcW w:type="dxa" w:w="1588"/>
+            <w:tcBorders>
+              <w:top w:val="none" w:color="FFFFFF" w:sz="0"/>
+              <w:left w:val="none" w:color="FFFFFF" w:sz="0"/>
+              <w:bottom w:val="none" w:color="FFFFFF" w:sz="0"/>
+              <w:right w:val="none" w:color="FFFFFF" w:sz="0"/>
+            </w:tcBorders>
+            <w:tcMar>
+              <w:top w:type="dxa" w:w="30"/>
+              <w:left w:type="dxa" w:w="70"/>
+              <w:bottom w:type="dxa" w:w="30"/>
+              <w:right w:type="dxa" w:w="70"/>
+            </w:tcMar>
+            <w:vAlign w:val="center"/>
+          </w:tcPr>
+          <w:p>
+            <w:pPr>
+              <w:keepNext/>
+              <w:spacing w:line="230"/>
+              <w:jc w:val="center"/>
+            </w:pPr>
+            <w:r>
+              <w:rPr>
+                <w:sz w:val="17"/>
+                <w:szCs w:val="17"/>
+              </w:rPr>
+              <w:t>2.4 × 10⁻⁵</w:t>
+            </w:r>
+          </w:p>
+        </w:tc>
+      </w:tr>
+      <w:tr>
+        <w:trPr>
+          <w:cantSplit/>
+        </w:trPr>
+        <w:tc>
+          <w:tcPr>
+            <w:tcW w:type="dxa" w:w="2700"/>
+            <w:tcBorders>
+              <w:top w:val="none" w:color="FFFFFF" w:sz="0"/>
+              <w:left w:val="none" w:color="FFFFFF" w:sz="0"/>
+              <w:bottom w:val="none" w:color="FFFFFF" w:sz="0"/>
+              <w:right w:val="none" w:color="FFFFFF" w:sz="0"/>
+            </w:tcBorders>
+            <w:tcMar>
+              <w:top w:type="dxa" w:w="30"/>
+              <w:left w:type="dxa" w:w="70"/>
+              <w:bottom w:type="dxa" w:w="30"/>
+              <w:right w:type="dxa" w:w="70"/>
+            </w:tcMar>
+            <w:vAlign w:val="center"/>
+          </w:tcPr>
+          <w:p>
+            <w:pPr>
+              <w:keepNext/>
+              <w:spacing w:line="230"/>
+              <w:jc w:val="left"/>
+            </w:pPr>
+            <w:r>
+              <w:rPr>
+                <w:sz w:val="17"/>
+                <w:szCs w:val="17"/>
+              </w:rPr>
+              <w:t>ConvNeXt-Tiny</w:t>
+            </w:r>
+          </w:p>
+        </w:tc>
+        <w:tc>
+          <w:tcPr>
+            <w:tcW w:type="dxa" w:w="1300"/>
+            <w:tcBorders>
+              <w:top w:val="none" w:color="FFFFFF" w:sz="0"/>
+              <w:left w:val="none" w:color="FFFFFF" w:sz="0"/>
+              <w:bottom w:val="none" w:color="FFFFFF" w:sz="0"/>
+              <w:right w:val="none" w:color="FFFFFF" w:sz="0"/>
+            </w:tcBorders>
+            <w:tcMar>
+              <w:top w:type="dxa" w:w="30"/>
+              <w:left w:type="dxa" w:w="70"/>
+              <w:bottom w:type="dxa" w:w="30"/>
+              <w:right w:type="dxa" w:w="70"/>
+            </w:tcMar>
+            <w:vAlign w:val="center"/>
+          </w:tcPr>
+          <w:p>
+            <w:pPr>
+              <w:keepNext/>
+              <w:spacing w:line="230"/>
+              <w:jc w:val="center"/>
+            </w:pPr>
+            <w:r>
+              <w:rPr>
+                <w:sz w:val="17"/>
+                <w:szCs w:val="17"/>
+              </w:rPr>
+              <w:t>28.6 M / 4.46</w:t>
+            </w:r>
+          </w:p>
+        </w:tc>
+        <w:tc>
+          <w:tcPr>
+            <w:tcW w:type="dxa" w:w="1450"/>
+            <w:tcBorders>
+              <w:top w:val="none" w:color="FFFFFF" w:sz="0"/>
+              <w:left w:val="none" w:color="FFFFFF" w:sz="0"/>
+              <w:bottom w:val="none" w:color="FFFFFF" w:sz="0"/>
+              <w:right w:val="none" w:color="FFFFFF" w:sz="0"/>
+            </w:tcBorders>
+            <w:tcMar>
+              <w:top w:type="dxa" w:w="30"/>
+              <w:left w:type="dxa" w:w="70"/>
+              <w:bottom w:type="dxa" w:w="30"/>
+              <w:right w:type="dxa" w:w="70"/>
+            </w:tcMar>
+            <w:vAlign w:val="center"/>
+          </w:tcPr>
+          <w:p>
+            <w:pPr>
+              <w:keepNext/>
+              <w:spacing w:line="230"/>
+              <w:jc w:val="center"/>
+            </w:pPr>
+            <w:r>
+              <w:rPr>
+                <w:sz w:val="17"/>
+                <w:szCs w:val="17"/>
+              </w:rPr>
+              <w:t>4.5 ms</w:t>
+            </w:r>
+          </w:p>
+        </w:tc>
+        <w:tc>
+          <w:tcPr>
+            <w:tcW w:type="dxa" w:w="1150"/>
+            <w:tcBorders>
+              <w:top w:val="none" w:color="FFFFFF" w:sz="0"/>
+              <w:left w:val="none" w:color="FFFFFF" w:sz="0"/>
+              <w:bottom w:val="none" w:color="FFFFFF" w:sz="0"/>
+              <w:right w:val="none" w:color="FFFFFF" w:sz="0"/>
+            </w:tcBorders>
+            <w:tcMar>
+              <w:top w:type="dxa" w:w="30"/>
+              <w:left w:type="dxa" w:w="70"/>
+              <w:bottom w:type="dxa" w:w="30"/>
+              <w:right w:type="dxa" w:w="70"/>
+            </w:tcMar>
+            <w:vAlign w:val="center"/>
+          </w:tcPr>
+          <w:p>
+            <w:pPr>
+              <w:keepNext/>
+              <w:spacing w:line="230"/>
+              <w:jc w:val="center"/>
+            </w:pPr>
+            <w:r>
+              <w:rPr>
+                <w:sz w:val="17"/>
+                <w:szCs w:val="17"/>
+              </w:rPr>
+              <w:t>752 /s</w:t>
+            </w:r>
+          </w:p>
+        </w:tc>
+        <w:tc>
+          <w:tcPr>
+            <w:tcW w:type="dxa" w:w="1450"/>
+            <w:tcBorders>
+              <w:top w:val="none" w:color="FFFFFF" w:sz="0"/>
+              <w:left w:val="none" w:color="FFFFFF" w:sz="0"/>
+              <w:bottom w:val="none" w:color="FFFFFF" w:sz="0"/>
+              <w:right w:val="none" w:color="FFFFFF" w:sz="0"/>
+            </w:tcBorders>
+            <w:tcMar>
+              <w:top w:type="dxa" w:w="30"/>
+              <w:left w:type="dxa" w:w="70"/>
+              <w:bottom w:type="dxa" w:w="30"/>
+              <w:right w:type="dxa" w:w="70"/>
+            </w:tcMar>
+            <w:vAlign w:val="center"/>
+          </w:tcPr>
+          <w:p>
+            <w:pPr>
+              <w:keepNext/>
+              <w:spacing w:line="230"/>
+              <w:jc w:val="center"/>
+            </w:pPr>
+            <w:r>
+              <w:rPr>
+                <w:sz w:val="17"/>
+                <w:szCs w:val="17"/>
+              </w:rPr>
+              <w:t>34.7 ms</w:t>
+            </w:r>
+          </w:p>
+        </w:tc>
+        <w:tc>
+          <w:tcPr>
+            <w:tcW w:type="dxa" w:w="1588"/>
+            <w:tcBorders>
+              <w:top w:val="none" w:color="FFFFFF" w:sz="0"/>
+              <w:left w:val="none" w:color="FFFFFF" w:sz="0"/>
+              <w:bottom w:val="none" w:color="FFFFFF" w:sz="0"/>
+              <w:right w:val="none" w:color="FFFFFF" w:sz="0"/>
+            </w:tcBorders>
+            <w:tcMar>
+              <w:top w:type="dxa" w:w="30"/>
+              <w:left w:type="dxa" w:w="70"/>
+              <w:bottom w:type="dxa" w:w="30"/>
+              <w:right w:type="dxa" w:w="70"/>
+            </w:tcMar>
+            <w:vAlign w:val="center"/>
+          </w:tcPr>
+          <w:p>
+            <w:pPr>
+              <w:keepNext/>
+              <w:spacing w:line="230"/>
+              <w:jc w:val="center"/>
+            </w:pPr>
+            <w:r>
+              <w:rPr>
+                <w:sz w:val="17"/>
+                <w:szCs w:val="17"/>
+              </w:rPr>
+              <w:t>5.7 × 10⁻⁶</w:t>
+            </w:r>
+          </w:p>
+        </w:tc>
+      </w:tr>
+      <w:tr>
+        <w:trPr>
+          <w:cantSplit/>
+        </w:trPr>
+        <w:tc>
+          <w:tcPr>
+            <w:tcW w:type="dxa" w:w="2700"/>
+            <w:tcBorders>
+              <w:top w:val="none" w:color="FFFFFF" w:sz="0"/>
+              <w:left w:val="none" w:color="FFFFFF" w:sz="0"/>
+              <w:bottom w:val="none" w:color="FFFFFF" w:sz="0"/>
+              <w:right w:val="none" w:color="FFFFFF" w:sz="0"/>
+            </w:tcBorders>
+            <w:tcMar>
+              <w:top w:type="dxa" w:w="30"/>
+              <w:left w:type="dxa" w:w="70"/>
+              <w:bottom w:type="dxa" w:w="30"/>
+              <w:right w:type="dxa" w:w="70"/>
+            </w:tcMar>
+            <w:vAlign w:val="center"/>
+          </w:tcPr>
+          <w:p>
+            <w:pPr>
+              <w:keepNext/>
+              <w:spacing w:line="230"/>
+              <w:jc w:val="left"/>
+            </w:pPr>
+            <w:r>
+              <w:rPr>
+                <w:sz w:val="17"/>
+                <w:szCs w:val="17"/>
+              </w:rPr>
+              <w:t>ViT-B/16</w:t>
+            </w:r>
+          </w:p>
+        </w:tc>
+        <w:tc>
+          <w:tcPr>
+            <w:tcW w:type="dxa" w:w="1300"/>
+            <w:tcBorders>
+              <w:top w:val="none" w:color="FFFFFF" w:sz="0"/>
+              <w:left w:val="none" w:color="FFFFFF" w:sz="0"/>
+              <w:bottom w:val="none" w:color="FFFFFF" w:sz="0"/>
+              <w:right w:val="none" w:color="FFFFFF" w:sz="0"/>
+            </w:tcBorders>
+            <w:tcMar>
+              <w:top w:type="dxa" w:w="30"/>
+              <w:left w:type="dxa" w:w="70"/>
+              <w:bottom w:type="dxa" w:w="30"/>
+              <w:right w:type="dxa" w:w="70"/>
+            </w:tcMar>
+            <w:vAlign w:val="center"/>
+          </w:tcPr>
+          <w:p>
+            <w:pPr>
+              <w:keepNext/>
+              <w:spacing w:line="230"/>
+              <w:jc w:val="center"/>
+            </w:pPr>
+            <w:r>
+              <w:rPr>
+                <w:sz w:val="17"/>
+                <w:szCs w:val="17"/>
+              </w:rPr>
+              <w:t>86.6 M / 11.3</w:t>
+            </w:r>
+          </w:p>
+        </w:tc>
+        <w:tc>
+          <w:tcPr>
+            <w:tcW w:type="dxa" w:w="1450"/>
+            <w:tcBorders>
+              <w:top w:val="none" w:color="FFFFFF" w:sz="0"/>
+              <w:left w:val="none" w:color="FFFFFF" w:sz="0"/>
+              <w:bottom w:val="none" w:color="FFFFFF" w:sz="0"/>
+              <w:right w:val="none" w:color="FFFFFF" w:sz="0"/>
+            </w:tcBorders>
+            <w:tcMar>
+              <w:top w:type="dxa" w:w="30"/>
+              <w:left w:type="dxa" w:w="70"/>
+              <w:bottom w:type="dxa" w:w="30"/>
+              <w:right w:type="dxa" w:w="70"/>
+            </w:tcMar>
+            <w:vAlign w:val="center"/>
+          </w:tcPr>
+          <w:p>
+            <w:pPr>
+              <w:keepNext/>
+              <w:spacing w:line="230"/>
+              <w:jc w:val="center"/>
+            </w:pPr>
+            <w:r>
+              <w:rPr>
+                <w:sz w:val="17"/>
+                <w:szCs w:val="17"/>
+              </w:rPr>
+              <w:t>9.6 ms</w:t>
+            </w:r>
+          </w:p>
+        </w:tc>
+        <w:tc>
+          <w:tcPr>
+            <w:tcW w:type="dxa" w:w="1150"/>
+            <w:tcBorders>
+              <w:top w:val="none" w:color="FFFFFF" w:sz="0"/>
+              <w:left w:val="none" w:color="FFFFFF" w:sz="0"/>
+              <w:bottom w:val="none" w:color="FFFFFF" w:sz="0"/>
+              <w:right w:val="none" w:color="FFFFFF" w:sz="0"/>
+            </w:tcBorders>
+            <w:tcMar>
+              <w:top w:type="dxa" w:w="30"/>
+              <w:left w:type="dxa" w:w="70"/>
+              <w:bottom w:type="dxa" w:w="30"/>
+              <w:right w:type="dxa" w:w="70"/>
+            </w:tcMar>
+            <w:vAlign w:val="center"/>
+          </w:tcPr>
+          <w:p>
+            <w:pPr>
+              <w:keepNext/>
+              <w:spacing w:line="230"/>
+              <w:jc w:val="center"/>
+            </w:pPr>
+            <w:r>
+              <w:rPr>
+                <w:sz w:val="17"/>
+                <w:szCs w:val="17"/>
+              </w:rPr>
+              <w:t>401 /s (b32)</w:t>
+            </w:r>
+          </w:p>
+        </w:tc>
+        <w:tc>
+          <w:tcPr>
+            <w:tcW w:type="dxa" w:w="1450"/>
+            <w:tcBorders>
+              <w:top w:val="none" w:color="FFFFFF" w:sz="0"/>
+              <w:left w:val="none" w:color="FFFFFF" w:sz="0"/>
+              <w:bottom w:val="none" w:color="FFFFFF" w:sz="0"/>
+              <w:right w:val="none" w:color="FFFFFF" w:sz="0"/>
+            </w:tcBorders>
+            <w:tcMar>
+              <w:top w:type="dxa" w:w="30"/>
+              <w:left w:type="dxa" w:w="70"/>
+              <w:bottom w:type="dxa" w:w="30"/>
+              <w:right w:type="dxa" w:w="70"/>
+            </w:tcMar>
+            <w:vAlign w:val="center"/>
+          </w:tcPr>
+          <w:p>
+            <w:pPr>
+              <w:keepNext/>
+              <w:spacing w:line="230"/>
+              <w:jc w:val="center"/>
+            </w:pPr>
+            <w:r>
+              <w:rPr>
+                <w:sz w:val="17"/>
+                <w:szCs w:val="17"/>
+              </w:rPr>
+              <w:t>108 ms</w:t>
+            </w:r>
+          </w:p>
+        </w:tc>
+        <w:tc>
+          <w:tcPr>
+            <w:tcW w:type="dxa" w:w="1588"/>
+            <w:tcBorders>
+              <w:top w:val="none" w:color="FFFFFF" w:sz="0"/>
+              <w:left w:val="none" w:color="FFFFFF" w:sz="0"/>
+              <w:bottom w:val="none" w:color="FFFFFF" w:sz="0"/>
+              <w:right w:val="none" w:color="FFFFFF" w:sz="0"/>
+            </w:tcBorders>
+            <w:tcMar>
+              <w:top w:type="dxa" w:w="30"/>
+              <w:left w:type="dxa" w:w="70"/>
+              <w:bottom w:type="dxa" w:w="30"/>
+              <w:right w:type="dxa" w:w="70"/>
+            </w:tcMar>
+            <w:vAlign w:val="center"/>
+          </w:tcPr>
+          <w:p>
+            <w:pPr>
+              <w:keepNext/>
+              <w:spacing w:line="230"/>
+              <w:jc w:val="center"/>
+            </w:pPr>
+            <w:r>
+              <w:rPr>
+                <w:sz w:val="17"/>
+                <w:szCs w:val="17"/>
+              </w:rPr>
+              <w:t>1.8 × 10⁻⁵</w:t>
+            </w:r>
+          </w:p>
+        </w:tc>
+      </w:tr>
+      <w:tr>
+        <w:trPr>
+          <w:cantSplit/>
+        </w:trPr>
+        <w:tc>
+          <w:tcPr>
+            <w:tcW w:type="dxa" w:w="2700"/>
+            <w:tcBorders>
+              <w:top w:val="none" w:color="FFFFFF" w:sz="0"/>
+              <w:left w:val="none" w:color="FFFFFF" w:sz="0"/>
+              <w:bottom w:val="single" w:color="000000" w:sz="4"/>
+              <w:right w:val="none" w:color="FFFFFF" w:sz="0"/>
+            </w:tcBorders>
+            <w:tcMar>
+              <w:top w:type="dxa" w:w="30"/>
+              <w:left w:type="dxa" w:w="70"/>
+              <w:bottom w:type="dxa" w:w="30"/>
+              <w:right w:type="dxa" w:w="70"/>
+            </w:tcMar>
+            <w:vAlign w:val="center"/>
+          </w:tcPr>
+          <w:p>
+            <w:pPr>
+              <w:keepNext w:val="false"/>
+              <w:spacing w:line="230"/>
+              <w:jc w:val="left"/>
+            </w:pPr>
+            <w:r>
+              <w:rPr>
+                <w:sz w:val="17"/>
+                <w:szCs w:val="17"/>
+              </w:rPr>
+              <w:t>R3D-18 (video)</w:t>
+            </w:r>
+          </w:p>
+        </w:tc>
+        <w:tc>
+          <w:tcPr>
+            <w:tcW w:type="dxa" w:w="1300"/>
+            <w:tcBorders>
+              <w:top w:val="none" w:color="FFFFFF" w:sz="0"/>
+              <w:left w:val="none" w:color="FFFFFF" w:sz="0"/>
+              <w:bottom w:val="single" w:color="000000" w:sz="4"/>
+              <w:right w:val="none" w:color="FFFFFF" w:sz="0"/>
+            </w:tcBorders>
+            <w:tcMar>
+              <w:top w:type="dxa" w:w="30"/>
+              <w:left w:type="dxa" w:w="70"/>
+              <w:bottom w:type="dxa" w:w="30"/>
+              <w:right w:type="dxa" w:w="70"/>
+            </w:tcMar>
+            <w:vAlign w:val="center"/>
+          </w:tcPr>
+          <w:p>
+            <w:pPr>
+              <w:keepNext w:val="false"/>
+              <w:spacing w:line="230"/>
+              <w:jc w:val="center"/>
+            </w:pPr>
+            <w:r>
+              <w:rPr>
+                <w:sz w:val="17"/>
+                <w:szCs w:val="17"/>
+              </w:rPr>
+              <w:t>33.4 M / 40.7</w:t>
+            </w:r>
+          </w:p>
+        </w:tc>
+        <w:tc>
+          <w:tcPr>
+            <w:tcW w:type="dxa" w:w="1450"/>
+            <w:tcBorders>
+              <w:top w:val="none" w:color="FFFFFF" w:sz="0"/>
+              <w:left w:val="none" w:color="FFFFFF" w:sz="0"/>
+              <w:bottom w:val="single" w:color="000000" w:sz="4"/>
+              <w:right w:val="none" w:color="FFFFFF" w:sz="0"/>
+            </w:tcBorders>
+            <w:tcMar>
+              <w:top w:type="dxa" w:w="30"/>
+              <w:left w:type="dxa" w:w="70"/>
+              <w:bottom w:type="dxa" w:w="30"/>
+              <w:right w:type="dxa" w:w="70"/>
+            </w:tcMar>
+            <w:vAlign w:val="center"/>
+          </w:tcPr>
+          <w:p>
+            <w:pPr>
+              <w:keepNext w:val="false"/>
+              <w:spacing w:line="230"/>
+              <w:jc w:val="center"/>
+            </w:pPr>
+            <w:r>
+              <w:rPr>
+                <w:sz w:val="17"/>
+                <w:szCs w:val="17"/>
+              </w:rPr>
+              <w:t>10.2 ms</w:t>
+            </w:r>
+          </w:p>
+        </w:tc>
+        <w:tc>
+          <w:tcPr>
+            <w:tcW w:type="dxa" w:w="1150"/>
+            <w:tcBorders>
+              <w:top w:val="none" w:color="FFFFFF" w:sz="0"/>
+              <w:left w:val="none" w:color="FFFFFF" w:sz="0"/>
+              <w:bottom w:val="single" w:color="000000" w:sz="4"/>
+              <w:right w:val="none" w:color="FFFFFF" w:sz="0"/>
+            </w:tcBorders>
+            <w:tcMar>
+              <w:top w:type="dxa" w:w="30"/>
+              <w:left w:type="dxa" w:w="70"/>
+              <w:bottom w:type="dxa" w:w="30"/>
+              <w:right w:type="dxa" w:w="70"/>
+            </w:tcMar>
+            <w:vAlign w:val="center"/>
+          </w:tcPr>
+          <w:p>
+            <w:pPr>
+              <w:keepNext w:val="false"/>
+              <w:spacing w:line="230"/>
+              <w:jc w:val="center"/>
+            </w:pPr>
+            <w:r>
+              <w:rPr>
+                <w:sz w:val="17"/>
+                <w:szCs w:val="17"/>
+              </w:rPr>
+              <w:t>187 clips/s (b16)</w:t>
+            </w:r>
+          </w:p>
+        </w:tc>
+        <w:tc>
+          <w:tcPr>
+            <w:tcW w:type="dxa" w:w="1450"/>
+            <w:tcBorders>
+              <w:top w:val="none" w:color="FFFFFF" w:sz="0"/>
+              <w:left w:val="none" w:color="FFFFFF" w:sz="0"/>
+              <w:bottom w:val="single" w:color="000000" w:sz="4"/>
+              <w:right w:val="none" w:color="FFFFFF" w:sz="0"/>
+            </w:tcBorders>
+            <w:tcMar>
+              <w:top w:type="dxa" w:w="30"/>
+              <w:left w:type="dxa" w:w="70"/>
+              <w:bottom w:type="dxa" w:w="30"/>
+              <w:right w:type="dxa" w:w="70"/>
+            </w:tcMar>
+            <w:vAlign w:val="center"/>
+          </w:tcPr>
+          <w:p>
+            <w:pPr>
+              <w:keepNext w:val="false"/>
+              <w:spacing w:line="230"/>
+              <w:jc w:val="center"/>
+            </w:pPr>
+            <w:r>
+              <w:rPr>
+                <w:sz w:val="17"/>
+                <w:szCs w:val="17"/>
+              </w:rPr>
+              <w:t>300 ms</w:t>
+            </w:r>
+          </w:p>
+        </w:tc>
+        <w:tc>
+          <w:tcPr>
+            <w:tcW w:type="dxa" w:w="1588"/>
+            <w:tcBorders>
+              <w:top w:val="none" w:color="FFFFFF" w:sz="0"/>
+              <w:left w:val="none" w:color="FFFFFF" w:sz="0"/>
+              <w:bottom w:val="single" w:color="000000" w:sz="4"/>
+              <w:right w:val="none" w:color="FFFFFF" w:sz="0"/>
+            </w:tcBorders>
+            <w:tcMar>
+              <w:top w:type="dxa" w:w="30"/>
+              <w:left w:type="dxa" w:w="70"/>
+              <w:bottom w:type="dxa" w:w="30"/>
+              <w:right w:type="dxa" w:w="70"/>
+            </w:tcMar>
+            <w:vAlign w:val="center"/>
+          </w:tcPr>
+          <w:p>
+            <w:pPr>
+              <w:keepNext w:val="false"/>
+              <w:spacing w:line="230"/>
+              <w:jc w:val="center"/>
+            </w:pPr>
+            <w:r>
+              <w:rPr>
+                <w:sz w:val="17"/>
+                <w:szCs w:val="17"/>
+              </w:rPr>
+              <w:t>4.5 × 10⁻⁶</w:t>
+            </w:r>
+          </w:p>
+        </w:tc>
+      </w:tr>
+    </w:tbl>
+    <w:p>
+      <w:pPr>
+        <w:spacing w:after="100"/>
+      </w:pPr>
+    </w:p>
+    <w:p>
+      <w:pPr>
+        <w:pStyle w:val="Heading2"/>
+        <w:keepNext/>
+        <w:spacing w:after="60" w:before="140"/>
+      </w:pPr>
+      <w:r>
+        <w:t>B. Exporting, importing and viewing</w:t>
+      </w:r>
+    </w:p>
+    <w:p>
+      <w:pPr>
+        <w:spacing w:after="80" w:line="264"/>
+        <w:ind w:firstLine="284"/>
+        <w:jc w:val="both"/>
+      </w:pPr>
+      <w:r>
+        <w:t>All seven ONNX exports reproduced PyTorch's logits to within 2.4 × 10⁻⁵ with the same top-1 class. ResNet-50 (97 MB, 122 operators) imported in 1.0–1.8 s and ViT-B/16 (331 MB, 1,016 operators) in 3.4–5.6 s. Fed the same photo of a pagoda through the new photo input, which crops and normalizes the image in the browser, both reported ImageNet class 698 (palace) first, as PyTorch did. A photo of a dahlia, which has no ImageNet class, drew low-confidence guesses such as daisy and honeycomb: a closed label set is a limit of the models, not of the tool.</w:t>
+      </w:r>
+    </w:p>
+    <w:p>
+      <w:pPr>
+        <w:spacing w:after="80" w:line="264"/>
+        <w:ind w:firstLine="284"/>
+        <w:jc w:val="both"/>
+      </w:pPr>
+      <w:r>
+        <w:t>Heavy models exposed weaknesses in the first design, and four changes followed. As a single row, ResNet-50 fitted to the screen was a line at 5% zoom; chains longer than 32 operators now wrap into rows that run alternately left to right and right to left (laid out in depth in 3D, Fig. 8), sized to about 16:9. ViT's constants and shape arithmetic all fell into the first column and blocked wrapping; operators not fed by a graph input are now placed just before their first consumer. Above 200 operators intermediates are not captured automatically, so the inspector and the attention list now offer to capture an operator and run again. Finally, a shared color scale left most ResNet channels and every ViT head nearly blank (activations reach 34 while the mean is 0.8; 197 attention weights per row average 0.005); an option to scale each map on its own makes their structure visible (Fig. 9). Five-dimensional video activations are read as [batch, channels, frames, height, width], one map per frame.</w:t>
+      </w:r>
+    </w:p>
+    <w:p>
+      <w:pPr>
+        <w:jc w:val="center"/>
+      </w:pPr>
+      <w:r>
+        <w:drawing>
+          <wp:inline xmlns:a="http://schemas.openxmlformats.org/drawingml/2006/main" xmlns:pic="http://schemas.openxmlformats.org/drawingml/2006/picture">
+            <wp:extent cx="5715000" cy="1721012"/>
+            <wp:docPr id="10" name="Picture 10"/>
+            <wp:cNvGraphicFramePr>
+              <a:graphicFrameLocks noChangeAspect="1"/>
+            </wp:cNvGraphicFramePr>
+            <a:graphic>
+              <a:graphicData uri="http://schemas.openxmlformats.org/drawingml/2006/picture">
+                <pic:pic>
+                  <pic:nvPicPr>
+                    <pic:cNvPr id="0" name="fig8_resnet_views.png"/>
+                    <pic:cNvPicPr/>
+                  </pic:nvPicPr>
+                  <pic:blipFill>
+                    <a:blip r:embed="rId18"/>
+                    <a:stretch>
+                      <a:fillRect/>
+                    </a:stretch>
+                  </pic:blipFill>
+                  <pic:spPr>
+                    <a:xfrm>
+                      <a:off x="0" y="0"/>
+                      <a:ext cx="5715000" cy="1721012"/>
+                    </a:xfrm>
+                    <a:prstGeom prst="rect"/>
+                  </pic:spPr>
+                </pic:pic>
+              </a:graphicData>
+            </a:graphic>
+          </wp:inline>
+        </w:drawing>
+      </w:r>
+    </w:p>
+    <w:p>
+      <w:pPr>
+        <w:spacing w:after="160" w:line="240"/>
+        <w:jc w:val="both"/>
+      </w:pPr>
+      <w:r>
+        <w:rPr>
+          <w:b/>
+          <w:bCs/>
+          <w:sz w:val="18"/>
+          <w:szCs w:val="18"/>
+        </w:rPr>
+        <w:t>Fig. 8. ResNet-50 (122 operators) imported from ONNX. Left: 2D view; long chains wrap into rows that alternate direction. Right: the same rows laid out in depth in the 3D view.</w:t>
+      </w:r>
+    </w:p>
+    <w:p>
+      <w:pPr>
+        <w:jc w:val="center"/>
+      </w:pPr>
+      <w:r>
+        <w:drawing>
+          <wp:inline xmlns:a="http://schemas.openxmlformats.org/drawingml/2006/main" xmlns:pic="http://schemas.openxmlformats.org/drawingml/2006/picture">
+            <wp:extent cx="5715000" cy="4899367"/>
+            <wp:docPr id="11" name="Picture 11"/>
+            <wp:cNvGraphicFramePr>
+              <a:graphicFrameLocks noChangeAspect="1"/>
+            </wp:cNvGraphicFramePr>
+            <a:graphic>
+              <a:graphicData uri="http://schemas.openxmlformats.org/drawingml/2006/picture">
+                <pic:pic>
+                  <pic:nvPicPr>
+                    <pic:cNvPr id="0" name="fig9_maps_attention.png"/>
+                    <pic:cNvPicPr/>
+                  </pic:nvPicPr>
+                  <pic:blipFill>
+                    <a:blip r:embed="rId19"/>
+                    <a:stretch>
+                      <a:fillRect/>
+                    </a:stretch>
+                  </pic:blipFill>
+                  <pic:spPr>
+                    <a:xfrm>
+                      <a:off x="0" y="0"/>
+                      <a:ext cx="5715000" cy="4899367"/>
+                    </a:xfrm>
+                    <a:prstGeom prst="rect"/>
+                  </pic:spPr>
+                </pic:pic>
+              </a:graphicData>
+            </a:graphic>
+          </wp:inline>
+        </w:drawing>
+      </w:r>
+    </w:p>
+    <w:p>
+      <w:pPr>
+        <w:spacing w:after="160" w:line="240"/>
+        <w:jc w:val="both"/>
+      </w:pPr>
+      <w:r>
+        <w:rPr>
+          <w:b/>
+          <w:bCs/>
+          <w:sz w:val="18"/>
+          <w:szCs w:val="18"/>
+        </w:rPr>
+        <w:t>Fig. 9. Left: ResNet-50 layer1.0 ReLU outputs (256 channels, 56 × 56) for the pagoda photo, each map on its own scale; the tower and the shoreline are visible. Right: ViT-B/16 encoder layer 0 attention (12 heads, 197 × 197 tokens), captured on request and scaled per head; heads 2, 5, 8 and 10 show clear structure.</w:t>
+      </w:r>
+    </w:p>
+    <w:p>
+      <w:pPr>
+        <w:pStyle w:val="Heading2"/>
+        <w:keepNext/>
+        <w:spacing w:after="60" w:before="140"/>
+      </w:pPr>
+      <w:r>
+        <w:t>C. Live GPU fine-tuning</w:t>
+      </w:r>
+    </w:p>
+    <w:p>
+      <w:pPr>
+        <w:spacing w:after="80" w:line="264"/>
+        <w:ind w:firstLine="284"/>
+        <w:jc w:val="both"/>
+      </w:pPr>
+      <w:r>
+        <w:t>Each classifier head was replaced with ten outputs and fine-tuned on the 1,797 handwritten digits that ship with scikit-learn (8 × 8, upsampled on the GPU to 224 × 224; 1,437 training and 360 test images), with AdamW, a one-cycle schedule, fp16 autocast and GradScaler. Every four batches the script logged loss and accuracy, HealthMonitor statistics and system figures to Live Runs (Fig. 10). Table VI summarizes the runs.</w:t>
+      </w:r>
+    </w:p>
+    <w:p>
+      <w:pPr>
+        <w:keepNext/>
+        <w:spacing w:after="20" w:before="140"/>
+        <w:jc w:val="center"/>
+      </w:pPr>
+      <w:r>
+        <w:rPr>
+          <w:sz w:val="17"/>
+          <w:szCs w:val="17"/>
+        </w:rPr>
+        <w:t>TABLE VI</w:t>
+      </w:r>
+    </w:p>
+    <w:p>
+      <w:pPr>
+        <w:keepNext/>
+        <w:spacing w:after="60"/>
+        <w:jc w:val="center"/>
+      </w:pPr>
+      <w:r>
+        <w:rPr>
+          <w:sz w:val="16"/>
+          <w:szCs w:val="16"/>
+        </w:rPr>
+        <w:t>FINE-TUNING ON DIGITS WITH LIVE TELEMETRY (RTX 4070 LAPTOP GPU)</w:t>
+      </w:r>
+    </w:p>
+    <w:tbl>
+      <w:tblPr>
+        <w:tblW w:type="dxa" w:w="9638"/>
+        <w:jc w:val="center"/>
+        <w:tblBorders>
+          <w:top w:val="single" w:color="auto" w:sz="4"/>
+          <w:left w:val="single" w:color="auto" w:sz="4"/>
+          <w:bottom w:val="single" w:color="auto" w:sz="4"/>
+          <w:right w:val="single" w:color="auto" w:sz="4"/>
+          <w:insideH w:val="single" w:color="auto" w:sz="4"/>
+          <w:insideV w:val="single" w:color="auto" w:sz="4"/>
+        </w:tblBorders>
+      </w:tblPr>
+      <w:tblGrid>
+        <w:gridCol w:w="2700"/>
+        <w:gridCol w:w="1300"/>
+        <w:gridCol w:w="1450"/>
+        <w:gridCol w:w="1150"/>
+        <w:gridCol w:w="1450"/>
+        <w:gridCol w:w="1588"/>
+      </w:tblGrid>
+      <w:tr>
+        <w:trPr>
+          <w:tblHeader/>
+        </w:trPr>
+        <w:tc>
+          <w:tcPr>
+            <w:tcW w:type="dxa" w:w="2700"/>
+            <w:tcBorders>
+              <w:top w:val="single" w:color="000000" w:sz="4"/>
+              <w:left w:val="none" w:color="FFFFFF" w:sz="0"/>
+              <w:bottom w:val="single" w:color="000000" w:sz="4"/>
+              <w:right w:val="none" w:color="FFFFFF" w:sz="0"/>
+            </w:tcBorders>
+            <w:tcMar>
+              <w:top w:type="dxa" w:w="30"/>
+              <w:left w:type="dxa" w:w="70"/>
+              <w:bottom w:type="dxa" w:w="30"/>
+              <w:right w:type="dxa" w:w="70"/>
+            </w:tcMar>
+            <w:vAlign w:val="center"/>
+          </w:tcPr>
+          <w:p>
+            <w:pPr>
+              <w:keepNext/>
+              <w:spacing w:line="230"/>
+              <w:jc w:val="center"/>
+            </w:pPr>
+            <w:r>
+              <w:rPr>
+                <w:b/>
+                <w:bCs/>
+                <w:sz w:val="17"/>
+                <w:szCs w:val="17"/>
+              </w:rPr>
+              <w:t>Model</w:t>
+            </w:r>
+          </w:p>
+        </w:tc>
+        <w:tc>
+          <w:tcPr>
+            <w:tcW w:type="dxa" w:w="1300"/>
+            <w:tcBorders>
+              <w:top w:val="single" w:color="000000" w:sz="4"/>
+              <w:left w:val="none" w:color="FFFFFF" w:sz="0"/>
+              <w:bottom w:val="single" w:color="000000" w:sz="4"/>
+              <w:right w:val="none" w:color="FFFFFF" w:sz="0"/>
+            </w:tcBorders>
+            <w:tcMar>
+              <w:top w:type="dxa" w:w="30"/>
+              <w:left w:type="dxa" w:w="70"/>
+              <w:bottom w:type="dxa" w:w="30"/>
+              <w:right w:type="dxa" w:w="70"/>
+            </w:tcMar>
+            <w:vAlign w:val="center"/>
+          </w:tcPr>
+          <w:p>
+            <w:pPr>
+              <w:keepNext/>
+              <w:spacing w:line="230"/>
+              <w:jc w:val="center"/>
+            </w:pPr>
+            <w:r>
+              <w:rPr>
+                <w:b/>
+                <w:bCs/>
+                <w:sz w:val="17"/>
+                <w:szCs w:val="17"/>
+              </w:rPr>
+              <w:t>Epochs</w:t>
+            </w:r>
+          </w:p>
+        </w:tc>
+        <w:tc>
+          <w:tcPr>
+            <w:tcW w:type="dxa" w:w="1450"/>
+            <w:tcBorders>
+              <w:top w:val="single" w:color="000000" w:sz="4"/>
+              <w:left w:val="none" w:color="FFFFFF" w:sz="0"/>
+              <w:bottom w:val="single" w:color="000000" w:sz="4"/>
+              <w:right w:val="none" w:color="FFFFFF" w:sz="0"/>
+            </w:tcBorders>
+            <w:tcMar>
+              <w:top w:type="dxa" w:w="30"/>
+              <w:left w:type="dxa" w:w="70"/>
+              <w:bottom w:type="dxa" w:w="30"/>
+              <w:right w:type="dxa" w:w="70"/>
+            </w:tcMar>
+            <w:vAlign w:val="center"/>
+          </w:tcPr>
+          <w:p>
+            <w:pPr>
+              <w:keepNext/>
+              <w:spacing w:line="230"/>
+              <w:jc w:val="center"/>
+            </w:pPr>
+            <w:r>
+              <w:rPr>
+                <w:b/>
+                <w:bCs/>
+                <w:sz w:val="17"/>
+                <w:szCs w:val="17"/>
+              </w:rPr>
+              <w:t>Train time</w:t>
+            </w:r>
+          </w:p>
+        </w:tc>
+        <w:tc>
+          <w:tcPr>
+            <w:tcW w:type="dxa" w:w="1150"/>
+            <w:tcBorders>
+              <w:top w:val="single" w:color="000000" w:sz="4"/>
+              <w:left w:val="none" w:color="FFFFFF" w:sz="0"/>
+              <w:bottom w:val="single" w:color="000000" w:sz="4"/>
+              <w:right w:val="none" w:color="FFFFFF" w:sz="0"/>
+            </w:tcBorders>
+            <w:tcMar>
+              <w:top w:type="dxa" w:w="30"/>
+              <w:left w:type="dxa" w:w="70"/>
+              <w:bottom w:type="dxa" w:w="30"/>
+              <w:right w:type="dxa" w:w="70"/>
+            </w:tcMar>
+            <w:vAlign w:val="center"/>
+          </w:tcPr>
+          <w:p>
+            <w:pPr>
+              <w:keepNext/>
+              <w:spacing w:line="230"/>
+              <w:jc w:val="center"/>
+            </w:pPr>
+            <w:r>
+              <w:rPr>
+                <w:b/>
+                <w:bCs/>
+                <w:sz w:val="17"/>
+                <w:szCs w:val="17"/>
+              </w:rPr>
+              <w:t>Images/s</w:t>
+            </w:r>
+          </w:p>
+        </w:tc>
+        <w:tc>
+          <w:tcPr>
+            <w:tcW w:type="dxa" w:w="1450"/>
+            <w:tcBorders>
+              <w:top w:val="single" w:color="000000" w:sz="4"/>
+              <w:left w:val="none" w:color="FFFFFF" w:sz="0"/>
+              <w:bottom w:val="single" w:color="000000" w:sz="4"/>
+              <w:right w:val="none" w:color="FFFFFF" w:sz="0"/>
+            </w:tcBorders>
+            <w:tcMar>
+              <w:top w:type="dxa" w:w="30"/>
+              <w:left w:type="dxa" w:w="70"/>
+              <w:bottom w:type="dxa" w:w="30"/>
+              <w:right w:type="dxa" w:w="70"/>
+            </w:tcMar>
+            <w:vAlign w:val="center"/>
+          </w:tcPr>
+          <w:p>
+            <w:pPr>
+              <w:keepNext/>
+              <w:spacing w:line="230"/>
+              <w:jc w:val="center"/>
+            </w:pPr>
+            <w:r>
+              <w:rPr>
+                <w:b/>
+                <w:bCs/>
+                <w:sz w:val="17"/>
+                <w:szCs w:val="17"/>
+              </w:rPr>
+              <w:t>Test accuracy</w:t>
+            </w:r>
+          </w:p>
+        </w:tc>
+        <w:tc>
+          <w:tcPr>
+            <w:tcW w:type="dxa" w:w="1588"/>
+            <w:tcBorders>
+              <w:top w:val="single" w:color="000000" w:sz="4"/>
+              <w:left w:val="none" w:color="FFFFFF" w:sz="0"/>
+              <w:bottom w:val="single" w:color="000000" w:sz="4"/>
+              <w:right w:val="none" w:color="FFFFFF" w:sz="0"/>
+            </w:tcBorders>
+            <w:tcMar>
+              <w:top w:type="dxa" w:w="30"/>
+              <w:left w:type="dxa" w:w="70"/>
+              <w:bottom w:type="dxa" w:w="30"/>
+              <w:right w:type="dxa" w:w="70"/>
+            </w:tcMar>
+            <w:vAlign w:val="center"/>
+          </w:tcPr>
+          <w:p>
+            <w:pPr>
+              <w:keepNext/>
+              <w:spacing w:line="230"/>
+              <w:jc w:val="center"/>
+            </w:pPr>
+            <w:r>
+              <w:rPr>
+                <w:b/>
+                <w:bCs/>
+                <w:sz w:val="17"/>
+                <w:szCs w:val="17"/>
+              </w:rPr>
+              <w:t>Peak GPU memory</w:t>
+            </w:r>
+          </w:p>
+        </w:tc>
+      </w:tr>
+      <w:tr>
+        <w:trPr>
+          <w:cantSplit/>
+        </w:trPr>
+        <w:tc>
+          <w:tcPr>
+            <w:tcW w:type="dxa" w:w="2700"/>
+            <w:tcBorders>
+              <w:top w:val="none" w:color="FFFFFF" w:sz="0"/>
+              <w:left w:val="none" w:color="FFFFFF" w:sz="0"/>
+              <w:bottom w:val="none" w:color="FFFFFF" w:sz="0"/>
+              <w:right w:val="none" w:color="FFFFFF" w:sz="0"/>
+            </w:tcBorders>
+            <w:tcMar>
+              <w:top w:type="dxa" w:w="30"/>
+              <w:left w:type="dxa" w:w="70"/>
+              <w:bottom w:type="dxa" w:w="30"/>
+              <w:right w:type="dxa" w:w="70"/>
+            </w:tcMar>
+            <w:vAlign w:val="center"/>
+          </w:tcPr>
+          <w:p>
+            <w:pPr>
+              <w:keepNext/>
+              <w:spacing w:line="230"/>
+              <w:jc w:val="left"/>
+            </w:pPr>
+            <w:r>
+              <w:rPr>
+                <w:sz w:val="17"/>
+                <w:szCs w:val="17"/>
+              </w:rPr>
+              <w:t>ResNet-18</w:t>
+            </w:r>
+          </w:p>
+        </w:tc>
+        <w:tc>
+          <w:tcPr>
+            <w:tcW w:type="dxa" w:w="1300"/>
+            <w:tcBorders>
+              <w:top w:val="none" w:color="FFFFFF" w:sz="0"/>
+              <w:left w:val="none" w:color="FFFFFF" w:sz="0"/>
+              <w:bottom w:val="none" w:color="FFFFFF" w:sz="0"/>
+              <w:right w:val="none" w:color="FFFFFF" w:sz="0"/>
+            </w:tcBorders>
+            <w:tcMar>
+              <w:top w:type="dxa" w:w="30"/>
+              <w:left w:type="dxa" w:w="70"/>
+              <w:bottom w:type="dxa" w:w="30"/>
+              <w:right w:type="dxa" w:w="70"/>
+            </w:tcMar>
+            <w:vAlign w:val="center"/>
+          </w:tcPr>
+          <w:p>
+            <w:pPr>
+              <w:keepNext/>
+              <w:spacing w:line="230"/>
+              <w:jc w:val="center"/>
+            </w:pPr>
+            <w:r>
+              <w:rPr>
+                <w:sz w:val="17"/>
+                <w:szCs w:val="17"/>
+              </w:rPr>
+              <w:t>5</w:t>
+            </w:r>
+          </w:p>
+        </w:tc>
+        <w:tc>
+          <w:tcPr>
+            <w:tcW w:type="dxa" w:w="1450"/>
+            <w:tcBorders>
+              <w:top w:val="none" w:color="FFFFFF" w:sz="0"/>
+              <w:left w:val="none" w:color="FFFFFF" w:sz="0"/>
+              <w:bottom w:val="none" w:color="FFFFFF" w:sz="0"/>
+              <w:right w:val="none" w:color="FFFFFF" w:sz="0"/>
+            </w:tcBorders>
+            <w:tcMar>
+              <w:top w:type="dxa" w:w="30"/>
+              <w:left w:type="dxa" w:w="70"/>
+              <w:bottom w:type="dxa" w:w="30"/>
+              <w:right w:type="dxa" w:w="70"/>
+            </w:tcMar>
+            <w:vAlign w:val="center"/>
+          </w:tcPr>
+          <w:p>
+            <w:pPr>
+              <w:keepNext/>
+              <w:spacing w:line="230"/>
+              <w:jc w:val="center"/>
+            </w:pPr>
+            <w:r>
+              <w:rPr>
+                <w:sz w:val="17"/>
+                <w:szCs w:val="17"/>
+              </w:rPr>
+              <w:t>28.8 s</w:t>
+            </w:r>
+          </w:p>
+        </w:tc>
+        <w:tc>
+          <w:tcPr>
+            <w:tcW w:type="dxa" w:w="1150"/>
+            <w:tcBorders>
+              <w:top w:val="none" w:color="FFFFFF" w:sz="0"/>
+              <w:left w:val="none" w:color="FFFFFF" w:sz="0"/>
+              <w:bottom w:val="none" w:color="FFFFFF" w:sz="0"/>
+              <w:right w:val="none" w:color="FFFFFF" w:sz="0"/>
+            </w:tcBorders>
+            <w:tcMar>
+              <w:top w:type="dxa" w:w="30"/>
+              <w:left w:type="dxa" w:w="70"/>
+              <w:bottom w:type="dxa" w:w="30"/>
+              <w:right w:type="dxa" w:w="70"/>
+            </w:tcMar>
+            <w:vAlign w:val="center"/>
+          </w:tcPr>
+          <w:p>
+            <w:pPr>
+              <w:keepNext/>
+              <w:spacing w:line="230"/>
+              <w:jc w:val="center"/>
+            </w:pPr>
+            <w:r>
+              <w:rPr>
+                <w:sz w:val="17"/>
+                <w:szCs w:val="17"/>
+              </w:rPr>
+              <w:t>249</w:t>
+            </w:r>
+          </w:p>
+        </w:tc>
+        <w:tc>
+          <w:tcPr>
+            <w:tcW w:type="dxa" w:w="1450"/>
+            <w:tcBorders>
+              <w:top w:val="none" w:color="FFFFFF" w:sz="0"/>
+              <w:left w:val="none" w:color="FFFFFF" w:sz="0"/>
+              <w:bottom w:val="none" w:color="FFFFFF" w:sz="0"/>
+              <w:right w:val="none" w:color="FFFFFF" w:sz="0"/>
+            </w:tcBorders>
+            <w:tcMar>
+              <w:top w:type="dxa" w:w="30"/>
+              <w:left w:type="dxa" w:w="70"/>
+              <w:bottom w:type="dxa" w:w="30"/>
+              <w:right w:type="dxa" w:w="70"/>
+            </w:tcMar>
+            <w:vAlign w:val="center"/>
+          </w:tcPr>
+          <w:p>
+            <w:pPr>
+              <w:keepNext/>
+              <w:spacing w:line="230"/>
+              <w:jc w:val="center"/>
+            </w:pPr>
+            <w:r>
+              <w:rPr>
+                <w:sz w:val="17"/>
+                <w:szCs w:val="17"/>
+              </w:rPr>
+              <w:t>98.9%</w:t>
+            </w:r>
+          </w:p>
+        </w:tc>
+        <w:tc>
+          <w:tcPr>
+            <w:tcW w:type="dxa" w:w="1588"/>
+            <w:tcBorders>
+              <w:top w:val="none" w:color="FFFFFF" w:sz="0"/>
+              <w:left w:val="none" w:color="FFFFFF" w:sz="0"/>
+              <w:bottom w:val="none" w:color="FFFFFF" w:sz="0"/>
+              <w:right w:val="none" w:color="FFFFFF" w:sz="0"/>
+            </w:tcBorders>
+            <w:tcMar>
+              <w:top w:type="dxa" w:w="30"/>
+              <w:left w:type="dxa" w:w="70"/>
+              <w:bottom w:type="dxa" w:w="30"/>
+              <w:right w:type="dxa" w:w="70"/>
+            </w:tcMar>
+            <w:vAlign w:val="center"/>
+          </w:tcPr>
+          <w:p>
+            <w:pPr>
+              <w:keepNext/>
+              <w:spacing w:line="230"/>
+              <w:jc w:val="center"/>
+            </w:pPr>
+            <w:r>
+              <w:rPr>
+                <w:sz w:val="17"/>
+                <w:szCs w:val="17"/>
+              </w:rPr>
+              <w:t>1.6 GB</w:t>
+            </w:r>
+          </w:p>
+        </w:tc>
+      </w:tr>
+      <w:tr>
+        <w:trPr>
+          <w:cantSplit/>
+        </w:trPr>
+        <w:tc>
+          <w:tcPr>
+            <w:tcW w:type="dxa" w:w="2700"/>
+            <w:tcBorders>
+              <w:top w:val="none" w:color="FFFFFF" w:sz="0"/>
+              <w:left w:val="none" w:color="FFFFFF" w:sz="0"/>
+              <w:bottom w:val="none" w:color="FFFFFF" w:sz="0"/>
+              <w:right w:val="none" w:color="FFFFFF" w:sz="0"/>
+            </w:tcBorders>
+            <w:tcMar>
+              <w:top w:type="dxa" w:w="30"/>
+              <w:left w:type="dxa" w:w="70"/>
+              <w:bottom w:type="dxa" w:w="30"/>
+              <w:right w:type="dxa" w:w="70"/>
+            </w:tcMar>
+            <w:vAlign w:val="center"/>
+          </w:tcPr>
+          <w:p>
+            <w:pPr>
+              <w:keepNext/>
+              <w:spacing w:line="230"/>
+              <w:jc w:val="left"/>
+            </w:pPr>
+            <w:r>
+              <w:rPr>
+                <w:sz w:val="17"/>
+                <w:szCs w:val="17"/>
+              </w:rPr>
+              <w:t>ResNet-50</w:t>
+            </w:r>
+          </w:p>
+        </w:tc>
+        <w:tc>
+          <w:tcPr>
+            <w:tcW w:type="dxa" w:w="1300"/>
+            <w:tcBorders>
+              <w:top w:val="none" w:color="FFFFFF" w:sz="0"/>
+              <w:left w:val="none" w:color="FFFFFF" w:sz="0"/>
+              <w:bottom w:val="none" w:color="FFFFFF" w:sz="0"/>
+              <w:right w:val="none" w:color="FFFFFF" w:sz="0"/>
+            </w:tcBorders>
+            <w:tcMar>
+              <w:top w:type="dxa" w:w="30"/>
+              <w:left w:type="dxa" w:w="70"/>
+              <w:bottom w:type="dxa" w:w="30"/>
+              <w:right w:type="dxa" w:w="70"/>
+            </w:tcMar>
+            <w:vAlign w:val="center"/>
+          </w:tcPr>
+          <w:p>
+            <w:pPr>
+              <w:keepNext/>
+              <w:spacing w:line="230"/>
+              <w:jc w:val="center"/>
+            </w:pPr>
+            <w:r>
+              <w:rPr>
+                <w:sz w:val="17"/>
+                <w:szCs w:val="17"/>
+              </w:rPr>
+              <w:t>6</w:t>
+            </w:r>
+          </w:p>
+        </w:tc>
+        <w:tc>
+          <w:tcPr>
+            <w:tcW w:type="dxa" w:w="1450"/>
+            <w:tcBorders>
+              <w:top w:val="none" w:color="FFFFFF" w:sz="0"/>
+              <w:left w:val="none" w:color="FFFFFF" w:sz="0"/>
+              <w:bottom w:val="none" w:color="FFFFFF" w:sz="0"/>
+              <w:right w:val="none" w:color="FFFFFF" w:sz="0"/>
+            </w:tcBorders>
+            <w:tcMar>
+              <w:top w:type="dxa" w:w="30"/>
+              <w:left w:type="dxa" w:w="70"/>
+              <w:bottom w:type="dxa" w:w="30"/>
+              <w:right w:type="dxa" w:w="70"/>
+            </w:tcMar>
+            <w:vAlign w:val="center"/>
+          </w:tcPr>
+          <w:p>
+            <w:pPr>
+              <w:keepNext/>
+              <w:spacing w:line="230"/>
+              <w:jc w:val="center"/>
+            </w:pPr>
+            <w:r>
+              <w:rPr>
+                <w:sz w:val="17"/>
+                <w:szCs w:val="17"/>
+              </w:rPr>
+              <w:t>64.9 s</w:t>
+            </w:r>
+          </w:p>
+        </w:tc>
+        <w:tc>
+          <w:tcPr>
+            <w:tcW w:type="dxa" w:w="1150"/>
+            <w:tcBorders>
+              <w:top w:val="none" w:color="FFFFFF" w:sz="0"/>
+              <w:left w:val="none" w:color="FFFFFF" w:sz="0"/>
+              <w:bottom w:val="none" w:color="FFFFFF" w:sz="0"/>
+              <w:right w:val="none" w:color="FFFFFF" w:sz="0"/>
+            </w:tcBorders>
+            <w:tcMar>
+              <w:top w:type="dxa" w:w="30"/>
+              <w:left w:type="dxa" w:w="70"/>
+              <w:bottom w:type="dxa" w:w="30"/>
+              <w:right w:type="dxa" w:w="70"/>
+            </w:tcMar>
+            <w:vAlign w:val="center"/>
+          </w:tcPr>
+          <w:p>
+            <w:pPr>
+              <w:keepNext/>
+              <w:spacing w:line="230"/>
+              <w:jc w:val="center"/>
+            </w:pPr>
+            <w:r>
+              <w:rPr>
+                <w:sz w:val="17"/>
+                <w:szCs w:val="17"/>
+              </w:rPr>
+              <w:t>133</w:t>
+            </w:r>
+          </w:p>
+        </w:tc>
+        <w:tc>
+          <w:tcPr>
+            <w:tcW w:type="dxa" w:w="1450"/>
+            <w:tcBorders>
+              <w:top w:val="none" w:color="FFFFFF" w:sz="0"/>
+              <w:left w:val="none" w:color="FFFFFF" w:sz="0"/>
+              <w:bottom w:val="none" w:color="FFFFFF" w:sz="0"/>
+              <w:right w:val="none" w:color="FFFFFF" w:sz="0"/>
+            </w:tcBorders>
+            <w:tcMar>
+              <w:top w:type="dxa" w:w="30"/>
+              <w:left w:type="dxa" w:w="70"/>
+              <w:bottom w:type="dxa" w:w="30"/>
+              <w:right w:type="dxa" w:w="70"/>
+            </w:tcMar>
+            <w:vAlign w:val="center"/>
+          </w:tcPr>
+          <w:p>
+            <w:pPr>
+              <w:keepNext/>
+              <w:spacing w:line="230"/>
+              <w:jc w:val="center"/>
+            </w:pPr>
+            <w:r>
+              <w:rPr>
+                <w:sz w:val="17"/>
+                <w:szCs w:val="17"/>
+              </w:rPr>
+              <w:t>99.4%</w:t>
+            </w:r>
+          </w:p>
+        </w:tc>
+        <w:tc>
+          <w:tcPr>
+            <w:tcW w:type="dxa" w:w="1588"/>
+            <w:tcBorders>
+              <w:top w:val="none" w:color="FFFFFF" w:sz="0"/>
+              <w:left w:val="none" w:color="FFFFFF" w:sz="0"/>
+              <w:bottom w:val="none" w:color="FFFFFF" w:sz="0"/>
+              <w:right w:val="none" w:color="FFFFFF" w:sz="0"/>
+            </w:tcBorders>
+            <w:tcMar>
+              <w:top w:type="dxa" w:w="30"/>
+              <w:left w:type="dxa" w:w="70"/>
+              <w:bottom w:type="dxa" w:w="30"/>
+              <w:right w:type="dxa" w:w="70"/>
+            </w:tcMar>
+            <w:vAlign w:val="center"/>
+          </w:tcPr>
+          <w:p>
+            <w:pPr>
+              <w:keepNext/>
+              <w:spacing w:line="230"/>
+              <w:jc w:val="center"/>
+            </w:pPr>
+            <w:r>
+              <w:rPr>
+                <w:sz w:val="17"/>
+                <w:szCs w:val="17"/>
+              </w:rPr>
+              <w:t>3.3 GB</w:t>
+            </w:r>
+          </w:p>
+        </w:tc>
+      </w:tr>
+      <w:tr>
+        <w:trPr>
+          <w:cantSplit/>
+        </w:trPr>
+        <w:tc>
+          <w:tcPr>
+            <w:tcW w:type="dxa" w:w="2700"/>
+            <w:tcBorders>
+              <w:top w:val="none" w:color="FFFFFF" w:sz="0"/>
+              <w:left w:val="none" w:color="FFFFFF" w:sz="0"/>
+              <w:bottom w:val="none" w:color="FFFFFF" w:sz="0"/>
+              <w:right w:val="none" w:color="FFFFFF" w:sz="0"/>
+            </w:tcBorders>
+            <w:tcMar>
+              <w:top w:type="dxa" w:w="30"/>
+              <w:left w:type="dxa" w:w="70"/>
+              <w:bottom w:type="dxa" w:w="30"/>
+              <w:right w:type="dxa" w:w="70"/>
+            </w:tcMar>
+            <w:vAlign w:val="center"/>
+          </w:tcPr>
+          <w:p>
+            <w:pPr>
+              <w:keepNext/>
+              <w:spacing w:line="230"/>
+              <w:jc w:val="left"/>
+            </w:pPr>
+            <w:r>
+              <w:rPr>
+                <w:sz w:val="17"/>
+                <w:szCs w:val="17"/>
+              </w:rPr>
+              <w:t>ConvNeXt-Tiny</w:t>
+            </w:r>
+          </w:p>
+        </w:tc>
+        <w:tc>
+          <w:tcPr>
+            <w:tcW w:type="dxa" w:w="1300"/>
+            <w:tcBorders>
+              <w:top w:val="none" w:color="FFFFFF" w:sz="0"/>
+              <w:left w:val="none" w:color="FFFFFF" w:sz="0"/>
+              <w:bottom w:val="none" w:color="FFFFFF" w:sz="0"/>
+              <w:right w:val="none" w:color="FFFFFF" w:sz="0"/>
+            </w:tcBorders>
+            <w:tcMar>
+              <w:top w:type="dxa" w:w="30"/>
+              <w:left w:type="dxa" w:w="70"/>
+              <w:bottom w:type="dxa" w:w="30"/>
+              <w:right w:type="dxa" w:w="70"/>
+            </w:tcMar>
+            <w:vAlign w:val="center"/>
+          </w:tcPr>
+          <w:p>
+            <w:pPr>
+              <w:keepNext/>
+              <w:spacing w:line="230"/>
+              <w:jc w:val="center"/>
+            </w:pPr>
+            <w:r>
+              <w:rPr>
+                <w:sz w:val="17"/>
+                <w:szCs w:val="17"/>
+              </w:rPr>
+              <w:t>5</w:t>
+            </w:r>
+          </w:p>
+        </w:tc>
+        <w:tc>
+          <w:tcPr>
+            <w:tcW w:type="dxa" w:w="1450"/>
+            <w:tcBorders>
+              <w:top w:val="none" w:color="FFFFFF" w:sz="0"/>
+              <w:left w:val="none" w:color="FFFFFF" w:sz="0"/>
+              <w:bottom w:val="none" w:color="FFFFFF" w:sz="0"/>
+              <w:right w:val="none" w:color="FFFFFF" w:sz="0"/>
+            </w:tcBorders>
+            <w:tcMar>
+              <w:top w:type="dxa" w:w="30"/>
+              <w:left w:type="dxa" w:w="70"/>
+              <w:bottom w:type="dxa" w:w="30"/>
+              <w:right w:type="dxa" w:w="70"/>
+            </w:tcMar>
+            <w:vAlign w:val="center"/>
+          </w:tcPr>
+          <w:p>
+            <w:pPr>
+              <w:keepNext/>
+              <w:spacing w:line="230"/>
+              <w:jc w:val="center"/>
+            </w:pPr>
+            <w:r>
+              <w:rPr>
+                <w:sz w:val="17"/>
+                <w:szCs w:val="17"/>
+              </w:rPr>
+              <w:t>71.3 s</w:t>
+            </w:r>
+          </w:p>
+        </w:tc>
+        <w:tc>
+          <w:tcPr>
+            <w:tcW w:type="dxa" w:w="1150"/>
+            <w:tcBorders>
+              <w:top w:val="none" w:color="FFFFFF" w:sz="0"/>
+              <w:left w:val="none" w:color="FFFFFF" w:sz="0"/>
+              <w:bottom w:val="none" w:color="FFFFFF" w:sz="0"/>
+              <w:right w:val="none" w:color="FFFFFF" w:sz="0"/>
+            </w:tcBorders>
+            <w:tcMar>
+              <w:top w:type="dxa" w:w="30"/>
+              <w:left w:type="dxa" w:w="70"/>
+              <w:bottom w:type="dxa" w:w="30"/>
+              <w:right w:type="dxa" w:w="70"/>
+            </w:tcMar>
+            <w:vAlign w:val="center"/>
+          </w:tcPr>
+          <w:p>
+            <w:pPr>
+              <w:keepNext/>
+              <w:spacing w:line="230"/>
+              <w:jc w:val="center"/>
+            </w:pPr>
+            <w:r>
+              <w:rPr>
+                <w:sz w:val="17"/>
+                <w:szCs w:val="17"/>
+              </w:rPr>
+              <w:t>101</w:t>
+            </w:r>
+          </w:p>
+        </w:tc>
+        <w:tc>
+          <w:tcPr>
+            <w:tcW w:type="dxa" w:w="1450"/>
+            <w:tcBorders>
+              <w:top w:val="none" w:color="FFFFFF" w:sz="0"/>
+              <w:left w:val="none" w:color="FFFFFF" w:sz="0"/>
+              <w:bottom w:val="none" w:color="FFFFFF" w:sz="0"/>
+              <w:right w:val="none" w:color="FFFFFF" w:sz="0"/>
+            </w:tcBorders>
+            <w:tcMar>
+              <w:top w:type="dxa" w:w="30"/>
+              <w:left w:type="dxa" w:w="70"/>
+              <w:bottom w:type="dxa" w:w="30"/>
+              <w:right w:type="dxa" w:w="70"/>
+            </w:tcMar>
+            <w:vAlign w:val="center"/>
+          </w:tcPr>
+          <w:p>
+            <w:pPr>
+              <w:keepNext/>
+              <w:spacing w:line="230"/>
+              <w:jc w:val="center"/>
+            </w:pPr>
+            <w:r>
+              <w:rPr>
+                <w:sz w:val="17"/>
+                <w:szCs w:val="17"/>
+              </w:rPr>
+              <w:t>99.4%</w:t>
+            </w:r>
+          </w:p>
+        </w:tc>
+        <w:tc>
+          <w:tcPr>
+            <w:tcW w:type="dxa" w:w="1588"/>
+            <w:tcBorders>
+              <w:top w:val="none" w:color="FFFFFF" w:sz="0"/>
+              <w:left w:val="none" w:color="FFFFFF" w:sz="0"/>
+              <w:bottom w:val="none" w:color="FFFFFF" w:sz="0"/>
+              <w:right w:val="none" w:color="FFFFFF" w:sz="0"/>
+            </w:tcBorders>
+            <w:tcMar>
+              <w:top w:type="dxa" w:w="30"/>
+              <w:left w:type="dxa" w:w="70"/>
+              <w:bottom w:type="dxa" w:w="30"/>
+              <w:right w:type="dxa" w:w="70"/>
+            </w:tcMar>
+            <w:vAlign w:val="center"/>
+          </w:tcPr>
+          <w:p>
+            <w:pPr>
+              <w:keepNext/>
+              <w:spacing w:line="230"/>
+              <w:jc w:val="center"/>
+            </w:pPr>
+            <w:r>
+              <w:rPr>
+                <w:sz w:val="17"/>
+                <w:szCs w:val="17"/>
+              </w:rPr>
+              <w:t>5.3 GB</w:t>
+            </w:r>
+          </w:p>
+        </w:tc>
+      </w:tr>
+      <w:tr>
+        <w:trPr>
+          <w:cantSplit/>
+        </w:trPr>
+        <w:tc>
+          <w:tcPr>
+            <w:tcW w:type="dxa" w:w="2700"/>
+            <w:tcBorders>
+              <w:top w:val="none" w:color="FFFFFF" w:sz="0"/>
+              <w:left w:val="none" w:color="FFFFFF" w:sz="0"/>
+              <w:bottom w:val="none" w:color="FFFFFF" w:sz="0"/>
+              <w:right w:val="none" w:color="FFFFFF" w:sz="0"/>
+            </w:tcBorders>
+            <w:tcMar>
+              <w:top w:type="dxa" w:w="30"/>
+              <w:left w:type="dxa" w:w="70"/>
+              <w:bottom w:type="dxa" w:w="30"/>
+              <w:right w:type="dxa" w:w="70"/>
+            </w:tcMar>
+            <w:vAlign w:val="center"/>
+          </w:tcPr>
+          <w:p>
+            <w:pPr>
+              <w:keepNext/>
+              <w:spacing w:line="230"/>
+              <w:jc w:val="left"/>
+            </w:pPr>
+            <w:r>
+              <w:rPr>
+                <w:sz w:val="17"/>
+                <w:szCs w:val="17"/>
+              </w:rPr>
+              <w:t>ViT-B/16 (batch 32)</w:t>
+            </w:r>
+          </w:p>
+        </w:tc>
+        <w:tc>
+          <w:tcPr>
+            <w:tcW w:type="dxa" w:w="1300"/>
+            <w:tcBorders>
+              <w:top w:val="none" w:color="FFFFFF" w:sz="0"/>
+              <w:left w:val="none" w:color="FFFFFF" w:sz="0"/>
+              <w:bottom w:val="none" w:color="FFFFFF" w:sz="0"/>
+              <w:right w:val="none" w:color="FFFFFF" w:sz="0"/>
+            </w:tcBorders>
+            <w:tcMar>
+              <w:top w:type="dxa" w:w="30"/>
+              <w:left w:type="dxa" w:w="70"/>
+              <w:bottom w:type="dxa" w:w="30"/>
+              <w:right w:type="dxa" w:w="70"/>
+            </w:tcMar>
+            <w:vAlign w:val="center"/>
+          </w:tcPr>
+          <w:p>
+            <w:pPr>
+              <w:keepNext/>
+              <w:spacing w:line="230"/>
+              <w:jc w:val="center"/>
+            </w:pPr>
+            <w:r>
+              <w:rPr>
+                <w:sz w:val="17"/>
+                <w:szCs w:val="17"/>
+              </w:rPr>
+              <w:t>5</w:t>
+            </w:r>
+          </w:p>
+        </w:tc>
+        <w:tc>
+          <w:tcPr>
+            <w:tcW w:type="dxa" w:w="1450"/>
+            <w:tcBorders>
+              <w:top w:val="none" w:color="FFFFFF" w:sz="0"/>
+              <w:left w:val="none" w:color="FFFFFF" w:sz="0"/>
+              <w:bottom w:val="none" w:color="FFFFFF" w:sz="0"/>
+              <w:right w:val="none" w:color="FFFFFF" w:sz="0"/>
+            </w:tcBorders>
+            <w:tcMar>
+              <w:top w:type="dxa" w:w="30"/>
+              <w:left w:type="dxa" w:w="70"/>
+              <w:bottom w:type="dxa" w:w="30"/>
+              <w:right w:type="dxa" w:w="70"/>
+            </w:tcMar>
+            <w:vAlign w:val="center"/>
+          </w:tcPr>
+          <w:p>
+            <w:pPr>
+              <w:keepNext/>
+              <w:spacing w:line="230"/>
+              <w:jc w:val="center"/>
+            </w:pPr>
+            <w:r>
+              <w:rPr>
+                <w:sz w:val="17"/>
+                <w:szCs w:val="17"/>
+              </w:rPr>
+              <w:t>82.3 s</w:t>
+            </w:r>
+          </w:p>
+        </w:tc>
+        <w:tc>
+          <w:tcPr>
+            <w:tcW w:type="dxa" w:w="1150"/>
+            <w:tcBorders>
+              <w:top w:val="none" w:color="FFFFFF" w:sz="0"/>
+              <w:left w:val="none" w:color="FFFFFF" w:sz="0"/>
+              <w:bottom w:val="none" w:color="FFFFFF" w:sz="0"/>
+              <w:right w:val="none" w:color="FFFFFF" w:sz="0"/>
+            </w:tcBorders>
+            <w:tcMar>
+              <w:top w:type="dxa" w:w="30"/>
+              <w:left w:type="dxa" w:w="70"/>
+              <w:bottom w:type="dxa" w:w="30"/>
+              <w:right w:type="dxa" w:w="70"/>
+            </w:tcMar>
+            <w:vAlign w:val="center"/>
+          </w:tcPr>
+          <w:p>
+            <w:pPr>
+              <w:keepNext/>
+              <w:spacing w:line="230"/>
+              <w:jc w:val="center"/>
+            </w:pPr>
+            <w:r>
+              <w:rPr>
+                <w:sz w:val="17"/>
+                <w:szCs w:val="17"/>
+              </w:rPr>
+              <w:t>87</w:t>
+            </w:r>
+          </w:p>
+        </w:tc>
+        <w:tc>
+          <w:tcPr>
+            <w:tcW w:type="dxa" w:w="1450"/>
+            <w:tcBorders>
+              <w:top w:val="none" w:color="FFFFFF" w:sz="0"/>
+              <w:left w:val="none" w:color="FFFFFF" w:sz="0"/>
+              <w:bottom w:val="none" w:color="FFFFFF" w:sz="0"/>
+              <w:right w:val="none" w:color="FFFFFF" w:sz="0"/>
+            </w:tcBorders>
+            <w:tcMar>
+              <w:top w:type="dxa" w:w="30"/>
+              <w:left w:type="dxa" w:w="70"/>
+              <w:bottom w:type="dxa" w:w="30"/>
+              <w:right w:type="dxa" w:w="70"/>
+            </w:tcMar>
+            <w:vAlign w:val="center"/>
+          </w:tcPr>
+          <w:p>
+            <w:pPr>
+              <w:keepNext/>
+              <w:spacing w:line="230"/>
+              <w:jc w:val="center"/>
+            </w:pPr>
+            <w:r>
+              <w:rPr>
+                <w:sz w:val="17"/>
+                <w:szCs w:val="17"/>
+              </w:rPr>
+              <w:t>99.7%</w:t>
+            </w:r>
+          </w:p>
+        </w:tc>
+        <w:tc>
+          <w:tcPr>
+            <w:tcW w:type="dxa" w:w="1588"/>
+            <w:tcBorders>
+              <w:top w:val="none" w:color="FFFFFF" w:sz="0"/>
+              <w:left w:val="none" w:color="FFFFFF" w:sz="0"/>
+              <w:bottom w:val="none" w:color="FFFFFF" w:sz="0"/>
+              <w:right w:val="none" w:color="FFFFFF" w:sz="0"/>
+            </w:tcBorders>
+            <w:tcMar>
+              <w:top w:type="dxa" w:w="30"/>
+              <w:left w:type="dxa" w:w="70"/>
+              <w:bottom w:type="dxa" w:w="30"/>
+              <w:right w:type="dxa" w:w="70"/>
+            </w:tcMar>
+            <w:vAlign w:val="center"/>
+          </w:tcPr>
+          <w:p>
+            <w:pPr>
+              <w:keepNext/>
+              <w:spacing w:line="230"/>
+              <w:jc w:val="center"/>
+            </w:pPr>
+            <w:r>
+              <w:rPr>
+                <w:sz w:val="17"/>
+                <w:szCs w:val="17"/>
+              </w:rPr>
+              <w:t>4.1 GB</w:t>
+            </w:r>
+          </w:p>
+        </w:tc>
+      </w:tr>
+      <w:tr>
+        <w:trPr>
+          <w:cantSplit/>
+        </w:trPr>
+        <w:tc>
+          <w:tcPr>
+            <w:tcW w:type="dxa" w:w="2700"/>
+            <w:tcBorders>
+              <w:top w:val="none" w:color="FFFFFF" w:sz="0"/>
+              <w:left w:val="none" w:color="FFFFFF" w:sz="0"/>
+              <w:bottom w:val="none" w:color="FFFFFF" w:sz="0"/>
+              <w:right w:val="none" w:color="FFFFFF" w:sz="0"/>
+            </w:tcBorders>
+            <w:tcMar>
+              <w:top w:type="dxa" w:w="30"/>
+              <w:left w:type="dxa" w:w="70"/>
+              <w:bottom w:type="dxa" w:w="30"/>
+              <w:right w:type="dxa" w:w="70"/>
+            </w:tcMar>
+            <w:vAlign w:val="center"/>
+          </w:tcPr>
+          <w:p>
+            <w:pPr>
+              <w:keepNext/>
+              <w:spacing w:line="230"/>
+              <w:jc w:val="left"/>
+            </w:pPr>
+            <w:r>
+              <w:rPr>
+                <w:sz w:val="17"/>
+                <w:szCs w:val="17"/>
+              </w:rPr>
+              <w:t>EfficientNet-B0</w:t>
+            </w:r>
+          </w:p>
+        </w:tc>
+        <w:tc>
+          <w:tcPr>
+            <w:tcW w:type="dxa" w:w="1300"/>
+            <w:tcBorders>
+              <w:top w:val="none" w:color="FFFFFF" w:sz="0"/>
+              <w:left w:val="none" w:color="FFFFFF" w:sz="0"/>
+              <w:bottom w:val="none" w:color="FFFFFF" w:sz="0"/>
+              <w:right w:val="none" w:color="FFFFFF" w:sz="0"/>
+            </w:tcBorders>
+            <w:tcMar>
+              <w:top w:type="dxa" w:w="30"/>
+              <w:left w:type="dxa" w:w="70"/>
+              <w:bottom w:type="dxa" w:w="30"/>
+              <w:right w:type="dxa" w:w="70"/>
+            </w:tcMar>
+            <w:vAlign w:val="center"/>
+          </w:tcPr>
+          <w:p>
+            <w:pPr>
+              <w:keepNext/>
+              <w:spacing w:line="230"/>
+              <w:jc w:val="center"/>
+            </w:pPr>
+            <w:r>
+              <w:rPr>
+                <w:sz w:val="17"/>
+                <w:szCs w:val="17"/>
+              </w:rPr>
+              <w:t>5</w:t>
+            </w:r>
+          </w:p>
+        </w:tc>
+        <w:tc>
+          <w:tcPr>
+            <w:tcW w:type="dxa" w:w="1450"/>
+            <w:tcBorders>
+              <w:top w:val="none" w:color="FFFFFF" w:sz="0"/>
+              <w:left w:val="none" w:color="FFFFFF" w:sz="0"/>
+              <w:bottom w:val="none" w:color="FFFFFF" w:sz="0"/>
+              <w:right w:val="none" w:color="FFFFFF" w:sz="0"/>
+            </w:tcBorders>
+            <w:tcMar>
+              <w:top w:type="dxa" w:w="30"/>
+              <w:left w:type="dxa" w:w="70"/>
+              <w:bottom w:type="dxa" w:w="30"/>
+              <w:right w:type="dxa" w:w="70"/>
+            </w:tcMar>
+            <w:vAlign w:val="center"/>
+          </w:tcPr>
+          <w:p>
+            <w:pPr>
+              <w:keepNext/>
+              <w:spacing w:line="230"/>
+              <w:jc w:val="center"/>
+            </w:pPr>
+            <w:r>
+              <w:rPr>
+                <w:sz w:val="17"/>
+                <w:szCs w:val="17"/>
+              </w:rPr>
+              <w:t>93.7 s</w:t>
+            </w:r>
+          </w:p>
+        </w:tc>
+        <w:tc>
+          <w:tcPr>
+            <w:tcW w:type="dxa" w:w="1150"/>
+            <w:tcBorders>
+              <w:top w:val="none" w:color="FFFFFF" w:sz="0"/>
+              <w:left w:val="none" w:color="FFFFFF" w:sz="0"/>
+              <w:bottom w:val="none" w:color="FFFFFF" w:sz="0"/>
+              <w:right w:val="none" w:color="FFFFFF" w:sz="0"/>
+            </w:tcBorders>
+            <w:tcMar>
+              <w:top w:type="dxa" w:w="30"/>
+              <w:left w:type="dxa" w:w="70"/>
+              <w:bottom w:type="dxa" w:w="30"/>
+              <w:right w:type="dxa" w:w="70"/>
+            </w:tcMar>
+            <w:vAlign w:val="center"/>
+          </w:tcPr>
+          <w:p>
+            <w:pPr>
+              <w:keepNext/>
+              <w:spacing w:line="230"/>
+              <w:jc w:val="center"/>
+            </w:pPr>
+            <w:r>
+              <w:rPr>
+                <w:sz w:val="17"/>
+                <w:szCs w:val="17"/>
+              </w:rPr>
+              <w:t>77</w:t>
+            </w:r>
+          </w:p>
+        </w:tc>
+        <w:tc>
+          <w:tcPr>
+            <w:tcW w:type="dxa" w:w="1450"/>
+            <w:tcBorders>
+              <w:top w:val="none" w:color="FFFFFF" w:sz="0"/>
+              <w:left w:val="none" w:color="FFFFFF" w:sz="0"/>
+              <w:bottom w:val="none" w:color="FFFFFF" w:sz="0"/>
+              <w:right w:val="none" w:color="FFFFFF" w:sz="0"/>
+            </w:tcBorders>
+            <w:tcMar>
+              <w:top w:type="dxa" w:w="30"/>
+              <w:left w:type="dxa" w:w="70"/>
+              <w:bottom w:type="dxa" w:w="30"/>
+              <w:right w:type="dxa" w:w="70"/>
+            </w:tcMar>
+            <w:vAlign w:val="center"/>
+          </w:tcPr>
+          <w:p>
+            <w:pPr>
+              <w:keepNext/>
+              <w:spacing w:line="230"/>
+              <w:jc w:val="center"/>
+            </w:pPr>
+            <w:r>
+              <w:rPr>
+                <w:sz w:val="17"/>
+                <w:szCs w:val="17"/>
+              </w:rPr>
+              <w:t>98.6%</w:t>
+            </w:r>
+          </w:p>
+        </w:tc>
+        <w:tc>
+          <w:tcPr>
+            <w:tcW w:type="dxa" w:w="1588"/>
+            <w:tcBorders>
+              <w:top w:val="none" w:color="FFFFFF" w:sz="0"/>
+              <w:left w:val="none" w:color="FFFFFF" w:sz="0"/>
+              <w:bottom w:val="none" w:color="FFFFFF" w:sz="0"/>
+              <w:right w:val="none" w:color="FFFFFF" w:sz="0"/>
+            </w:tcBorders>
+            <w:tcMar>
+              <w:top w:type="dxa" w:w="30"/>
+              <w:left w:type="dxa" w:w="70"/>
+              <w:bottom w:type="dxa" w:w="30"/>
+              <w:right w:type="dxa" w:w="70"/>
+            </w:tcMar>
+            <w:vAlign w:val="center"/>
+          </w:tcPr>
+          <w:p>
+            <w:pPr>
+              <w:keepNext/>
+              <w:spacing w:line="230"/>
+              <w:jc w:val="center"/>
+            </w:pPr>
+            <w:r>
+              <w:rPr>
+                <w:sz w:val="17"/>
+                <w:szCs w:val="17"/>
+              </w:rPr>
+              <w:t>2.9 GB</w:t>
+            </w:r>
+          </w:p>
+        </w:tc>
+      </w:tr>
+      <w:tr>
+        <w:trPr>
+          <w:cantSplit/>
+        </w:trPr>
+        <w:tc>
+          <w:tcPr>
+            <w:tcW w:type="dxa" w:w="2700"/>
+            <w:tcBorders>
+              <w:top w:val="none" w:color="FFFFFF" w:sz="0"/>
+              <w:left w:val="none" w:color="FFFFFF" w:sz="0"/>
+              <w:bottom w:val="none" w:color="FFFFFF" w:sz="0"/>
+              <w:right w:val="none" w:color="FFFFFF" w:sz="0"/>
+            </w:tcBorders>
+            <w:tcMar>
+              <w:top w:type="dxa" w:w="30"/>
+              <w:left w:type="dxa" w:w="70"/>
+              <w:bottom w:type="dxa" w:w="30"/>
+              <w:right w:type="dxa" w:w="70"/>
+            </w:tcMar>
+            <w:vAlign w:val="center"/>
+          </w:tcPr>
+          <w:p>
+            <w:pPr>
+              <w:keepNext/>
+              <w:spacing w:line="230"/>
+              <w:jc w:val="left"/>
+            </w:pPr>
+            <w:r>
+              <w:rPr>
+                <w:sz w:val="17"/>
+                <w:szCs w:val="17"/>
+              </w:rPr>
+              <w:t>MobileNetV3-L</w:t>
+            </w:r>
+          </w:p>
+        </w:tc>
+        <w:tc>
+          <w:tcPr>
+            <w:tcW w:type="dxa" w:w="1300"/>
+            <w:tcBorders>
+              <w:top w:val="none" w:color="FFFFFF" w:sz="0"/>
+              <w:left w:val="none" w:color="FFFFFF" w:sz="0"/>
+              <w:bottom w:val="none" w:color="FFFFFF" w:sz="0"/>
+              <w:right w:val="none" w:color="FFFFFF" w:sz="0"/>
+            </w:tcBorders>
+            <w:tcMar>
+              <w:top w:type="dxa" w:w="30"/>
+              <w:left w:type="dxa" w:w="70"/>
+              <w:bottom w:type="dxa" w:w="30"/>
+              <w:right w:type="dxa" w:w="70"/>
+            </w:tcMar>
+            <w:vAlign w:val="center"/>
+          </w:tcPr>
+          <w:p>
+            <w:pPr>
+              <w:keepNext/>
+              <w:spacing w:line="230"/>
+              <w:jc w:val="center"/>
+            </w:pPr>
+            <w:r>
+              <w:rPr>
+                <w:sz w:val="17"/>
+                <w:szCs w:val="17"/>
+              </w:rPr>
+              <w:t>5</w:t>
+            </w:r>
+          </w:p>
+        </w:tc>
+        <w:tc>
+          <w:tcPr>
+            <w:tcW w:type="dxa" w:w="1450"/>
+            <w:tcBorders>
+              <w:top w:val="none" w:color="FFFFFF" w:sz="0"/>
+              <w:left w:val="none" w:color="FFFFFF" w:sz="0"/>
+              <w:bottom w:val="none" w:color="FFFFFF" w:sz="0"/>
+              <w:right w:val="none" w:color="FFFFFF" w:sz="0"/>
+            </w:tcBorders>
+            <w:tcMar>
+              <w:top w:type="dxa" w:w="30"/>
+              <w:left w:type="dxa" w:w="70"/>
+              <w:bottom w:type="dxa" w:w="30"/>
+              <w:right w:type="dxa" w:w="70"/>
+            </w:tcMar>
+            <w:vAlign w:val="center"/>
+          </w:tcPr>
+          <w:p>
+            <w:pPr>
+              <w:keepNext/>
+              <w:spacing w:line="230"/>
+              <w:jc w:val="center"/>
+            </w:pPr>
+            <w:r>
+              <w:rPr>
+                <w:sz w:val="17"/>
+                <w:szCs w:val="17"/>
+              </w:rPr>
+              <w:t>79.1 s</w:t>
+            </w:r>
+          </w:p>
+        </w:tc>
+        <w:tc>
+          <w:tcPr>
+            <w:tcW w:type="dxa" w:w="1150"/>
+            <w:tcBorders>
+              <w:top w:val="none" w:color="FFFFFF" w:sz="0"/>
+              <w:left w:val="none" w:color="FFFFFF" w:sz="0"/>
+              <w:bottom w:val="none" w:color="FFFFFF" w:sz="0"/>
+              <w:right w:val="none" w:color="FFFFFF" w:sz="0"/>
+            </w:tcBorders>
+            <w:tcMar>
+              <w:top w:type="dxa" w:w="30"/>
+              <w:left w:type="dxa" w:w="70"/>
+              <w:bottom w:type="dxa" w:w="30"/>
+              <w:right w:type="dxa" w:w="70"/>
+            </w:tcMar>
+            <w:vAlign w:val="center"/>
+          </w:tcPr>
+          <w:p>
+            <w:pPr>
+              <w:keepNext/>
+              <w:spacing w:line="230"/>
+              <w:jc w:val="center"/>
+            </w:pPr>
+            <w:r>
+              <w:rPr>
+                <w:sz w:val="17"/>
+                <w:szCs w:val="17"/>
+              </w:rPr>
+              <w:t>91</w:t>
+            </w:r>
+          </w:p>
+        </w:tc>
+        <w:tc>
+          <w:tcPr>
+            <w:tcW w:type="dxa" w:w="1450"/>
+            <w:tcBorders>
+              <w:top w:val="none" w:color="FFFFFF" w:sz="0"/>
+              <w:left w:val="none" w:color="FFFFFF" w:sz="0"/>
+              <w:bottom w:val="none" w:color="FFFFFF" w:sz="0"/>
+              <w:right w:val="none" w:color="FFFFFF" w:sz="0"/>
+            </w:tcBorders>
+            <w:tcMar>
+              <w:top w:type="dxa" w:w="30"/>
+              <w:left w:type="dxa" w:w="70"/>
+              <w:bottom w:type="dxa" w:w="30"/>
+              <w:right w:type="dxa" w:w="70"/>
+            </w:tcMar>
+            <w:vAlign w:val="center"/>
+          </w:tcPr>
+          <w:p>
+            <w:pPr>
+              <w:keepNext/>
+              <w:spacing w:line="230"/>
+              <w:jc w:val="center"/>
+            </w:pPr>
+            <w:r>
+              <w:rPr>
+                <w:sz w:val="17"/>
+                <w:szCs w:val="17"/>
+              </w:rPr>
+              <w:t>52.5%</w:t>
+            </w:r>
+          </w:p>
+        </w:tc>
+        <w:tc>
+          <w:tcPr>
+            <w:tcW w:type="dxa" w:w="1588"/>
+            <w:tcBorders>
+              <w:top w:val="none" w:color="FFFFFF" w:sz="0"/>
+              <w:left w:val="none" w:color="FFFFFF" w:sz="0"/>
+              <w:bottom w:val="none" w:color="FFFFFF" w:sz="0"/>
+              <w:right w:val="none" w:color="FFFFFF" w:sz="0"/>
+            </w:tcBorders>
+            <w:tcMar>
+              <w:top w:type="dxa" w:w="30"/>
+              <w:left w:type="dxa" w:w="70"/>
+              <w:bottom w:type="dxa" w:w="30"/>
+              <w:right w:type="dxa" w:w="70"/>
+            </w:tcMar>
+            <w:vAlign w:val="center"/>
+          </w:tcPr>
+          <w:p>
+            <w:pPr>
+              <w:keepNext/>
+              <w:spacing w:line="230"/>
+              <w:jc w:val="center"/>
+            </w:pPr>
+            <w:r>
+              <w:rPr>
+                <w:sz w:val="17"/>
+                <w:szCs w:val="17"/>
+              </w:rPr>
+              <w:t>1.5 GB</w:t>
+            </w:r>
+          </w:p>
+        </w:tc>
+      </w:tr>
+      <w:tr>
+        <w:trPr>
+          <w:cantSplit/>
+        </w:trPr>
+        <w:tc>
+          <w:tcPr>
+            <w:tcW w:type="dxa" w:w="2700"/>
+            <w:tcBorders>
+              <w:top w:val="none" w:color="FFFFFF" w:sz="0"/>
+              <w:left w:val="none" w:color="FFFFFF" w:sz="0"/>
+              <w:bottom w:val="single" w:color="000000" w:sz="4"/>
+              <w:right w:val="none" w:color="FFFFFF" w:sz="0"/>
+            </w:tcBorders>
+            <w:tcMar>
+              <w:top w:type="dxa" w:w="30"/>
+              <w:left w:type="dxa" w:w="70"/>
+              <w:bottom w:type="dxa" w:w="30"/>
+              <w:right w:type="dxa" w:w="70"/>
+            </w:tcMar>
+            <w:vAlign w:val="center"/>
+          </w:tcPr>
+          <w:p>
+            <w:pPr>
+              <w:keepNext w:val="false"/>
+              <w:spacing w:line="230"/>
+              <w:jc w:val="left"/>
+            </w:pPr>
+            <w:r>
+              <w:rPr>
+                <w:sz w:val="17"/>
+                <w:szCs w:val="17"/>
+              </w:rPr>
+              <w:t>MobileNetV3-L, BN momentum 0.1</w:t>
+            </w:r>
+          </w:p>
+        </w:tc>
+        <w:tc>
+          <w:tcPr>
+            <w:tcW w:type="dxa" w:w="1300"/>
+            <w:tcBorders>
+              <w:top w:val="none" w:color="FFFFFF" w:sz="0"/>
+              <w:left w:val="none" w:color="FFFFFF" w:sz="0"/>
+              <w:bottom w:val="single" w:color="000000" w:sz="4"/>
+              <w:right w:val="none" w:color="FFFFFF" w:sz="0"/>
+            </w:tcBorders>
+            <w:tcMar>
+              <w:top w:type="dxa" w:w="30"/>
+              <w:left w:type="dxa" w:w="70"/>
+              <w:bottom w:type="dxa" w:w="30"/>
+              <w:right w:type="dxa" w:w="70"/>
+            </w:tcMar>
+            <w:vAlign w:val="center"/>
+          </w:tcPr>
+          <w:p>
+            <w:pPr>
+              <w:keepNext w:val="false"/>
+              <w:spacing w:line="230"/>
+              <w:jc w:val="center"/>
+            </w:pPr>
+            <w:r>
+              <w:rPr>
+                <w:sz w:val="17"/>
+                <w:szCs w:val="17"/>
+              </w:rPr>
+              <w:t>5</w:t>
+            </w:r>
+          </w:p>
+        </w:tc>
+        <w:tc>
+          <w:tcPr>
+            <w:tcW w:type="dxa" w:w="1450"/>
+            <w:tcBorders>
+              <w:top w:val="none" w:color="FFFFFF" w:sz="0"/>
+              <w:left w:val="none" w:color="FFFFFF" w:sz="0"/>
+              <w:bottom w:val="single" w:color="000000" w:sz="4"/>
+              <w:right w:val="none" w:color="FFFFFF" w:sz="0"/>
+            </w:tcBorders>
+            <w:tcMar>
+              <w:top w:type="dxa" w:w="30"/>
+              <w:left w:type="dxa" w:w="70"/>
+              <w:bottom w:type="dxa" w:w="30"/>
+              <w:right w:type="dxa" w:w="70"/>
+            </w:tcMar>
+            <w:vAlign w:val="center"/>
+          </w:tcPr>
+          <w:p>
+            <w:pPr>
+              <w:keepNext w:val="false"/>
+              <w:spacing w:line="230"/>
+              <w:jc w:val="center"/>
+            </w:pPr>
+            <w:r>
+              <w:rPr>
+                <w:sz w:val="17"/>
+                <w:szCs w:val="17"/>
+              </w:rPr>
+              <w:t>67.4 s</w:t>
+            </w:r>
+          </w:p>
+        </w:tc>
+        <w:tc>
+          <w:tcPr>
+            <w:tcW w:type="dxa" w:w="1150"/>
+            <w:tcBorders>
+              <w:top w:val="none" w:color="FFFFFF" w:sz="0"/>
+              <w:left w:val="none" w:color="FFFFFF" w:sz="0"/>
+              <w:bottom w:val="single" w:color="000000" w:sz="4"/>
+              <w:right w:val="none" w:color="FFFFFF" w:sz="0"/>
+            </w:tcBorders>
+            <w:tcMar>
+              <w:top w:type="dxa" w:w="30"/>
+              <w:left w:type="dxa" w:w="70"/>
+              <w:bottom w:type="dxa" w:w="30"/>
+              <w:right w:type="dxa" w:w="70"/>
+            </w:tcMar>
+            <w:vAlign w:val="center"/>
+          </w:tcPr>
+          <w:p>
+            <w:pPr>
+              <w:keepNext w:val="false"/>
+              <w:spacing w:line="230"/>
+              <w:jc w:val="center"/>
+            </w:pPr>
+            <w:r>
+              <w:rPr>
+                <w:sz w:val="17"/>
+                <w:szCs w:val="17"/>
+              </w:rPr>
+              <w:t>107</w:t>
+            </w:r>
+          </w:p>
+        </w:tc>
+        <w:tc>
+          <w:tcPr>
+            <w:tcW w:type="dxa" w:w="1450"/>
+            <w:tcBorders>
+              <w:top w:val="none" w:color="FFFFFF" w:sz="0"/>
+              <w:left w:val="none" w:color="FFFFFF" w:sz="0"/>
+              <w:bottom w:val="single" w:color="000000" w:sz="4"/>
+              <w:right w:val="none" w:color="FFFFFF" w:sz="0"/>
+            </w:tcBorders>
+            <w:tcMar>
+              <w:top w:type="dxa" w:w="30"/>
+              <w:left w:type="dxa" w:w="70"/>
+              <w:bottom w:type="dxa" w:w="30"/>
+              <w:right w:type="dxa" w:w="70"/>
+            </w:tcMar>
+            <w:vAlign w:val="center"/>
+          </w:tcPr>
+          <w:p>
+            <w:pPr>
+              <w:keepNext w:val="false"/>
+              <w:spacing w:line="230"/>
+              <w:jc w:val="center"/>
+            </w:pPr>
+            <w:r>
+              <w:rPr>
+                <w:sz w:val="17"/>
+                <w:szCs w:val="17"/>
+              </w:rPr>
+              <w:t>98.6%</w:t>
+            </w:r>
+          </w:p>
+        </w:tc>
+        <w:tc>
+          <w:tcPr>
+            <w:tcW w:type="dxa" w:w="1588"/>
+            <w:tcBorders>
+              <w:top w:val="none" w:color="FFFFFF" w:sz="0"/>
+              <w:left w:val="none" w:color="FFFFFF" w:sz="0"/>
+              <w:bottom w:val="single" w:color="000000" w:sz="4"/>
+              <w:right w:val="none" w:color="FFFFFF" w:sz="0"/>
+            </w:tcBorders>
+            <w:tcMar>
+              <w:top w:type="dxa" w:w="30"/>
+              <w:left w:type="dxa" w:w="70"/>
+              <w:bottom w:type="dxa" w:w="30"/>
+              <w:right w:type="dxa" w:w="70"/>
+            </w:tcMar>
+            <w:vAlign w:val="center"/>
+          </w:tcPr>
+          <w:p>
+            <w:pPr>
+              <w:keepNext w:val="false"/>
+              <w:spacing w:line="230"/>
+              <w:jc w:val="center"/>
+            </w:pPr>
+            <w:r>
+              <w:rPr>
+                <w:sz w:val="17"/>
+                <w:szCs w:val="17"/>
+              </w:rPr>
+              <w:t>1.5 GB</w:t>
+            </w:r>
+          </w:p>
+        </w:tc>
+      </w:tr>
+    </w:tbl>
+    <w:p>
+      <w:pPr>
+        <w:spacing w:after="100"/>
+      </w:pPr>
+    </w:p>
+    <w:p>
+      <w:pPr>
+        <w:spacing w:after="80" w:line="264"/>
+        <w:ind w:firstLine="284"/>
+        <w:jc w:val="both"/>
+      </w:pPr>
+      <w:r>
+        <w:t>MobileNetV3 reached 99% training accuracy but only 52.5% on the test set, and Live Runs showed the gap from the first epochs. torchvision builds this model with a BatchNorm [19] momentum of 0.01, so in about 115 steps the running statistics barely moved from ImageNet's towards the new images, and evaluation, which uses them, failed. With momentum 0.1 the same run reached 98.6%. It is the only model here built with 0.01, and the only one that failed. A health alert also fired for a squeeze-and-excitation ReLU in that model that was dead on the whole probe batch. A first ViT run raised a false non-finite-gradient alert from GradScaler's deliberate overflow steps; the script now skips health collection on steps the scaler rejected, and the alert's advice explains the case.</w:t>
+      </w:r>
+    </w:p>
+    <w:p>
+      <w:pPr>
+        <w:spacing w:after="80" w:line="264"/>
+        <w:ind w:firstLine="284"/>
+        <w:jc w:val="both"/>
+      </w:pPr>
+      <w:r>
+        <w:t>Monitoring is not free: collecting per-layer health every four batches cut throughput by about 30% for ResNet-18 (249 vs 359 images/s without it) and 20% for MobileNetV3, so long runs should collect less often. During training the GPU was mostly 90–100% busy, dipping during the per-epoch test pass and health collection, at 49–55 W and 67–72 °C, while the CPU stayed at 15–30%.</w:t>
+      </w:r>
+    </w:p>
+    <w:p>
+      <w:pPr>
+        <w:jc w:val="center"/>
+      </w:pPr>
+      <w:r>
+        <w:drawing>
+          <wp:inline xmlns:a="http://schemas.openxmlformats.org/drawingml/2006/main" xmlns:pic="http://schemas.openxmlformats.org/drawingml/2006/picture">
+            <wp:extent cx="3657600" cy="5003956"/>
+            <wp:docPr id="12" name="Picture 12"/>
+            <wp:cNvGraphicFramePr>
+              <a:graphicFrameLocks noChangeAspect="1"/>
+            </wp:cNvGraphicFramePr>
+            <a:graphic>
+              <a:graphicData uri="http://schemas.openxmlformats.org/drawingml/2006/picture">
+                <pic:pic>
+                  <pic:nvPicPr>
+                    <pic:cNvPr id="0" name="fig10_system.png"/>
+                    <pic:cNvPicPr/>
+                  </pic:nvPicPr>
+                  <pic:blipFill>
+                    <a:blip r:embed="rId20"/>
+                    <a:stretch>
+                      <a:fillRect/>
+                    </a:stretch>
+                  </pic:blipFill>
+                  <pic:spPr>
+                    <a:xfrm>
+                      <a:off x="0" y="0"/>
+                      <a:ext cx="3657600" cy="5003956"/>
+                    </a:xfrm>
+                    <a:prstGeom prst="rect"/>
+                  </pic:spPr>
+                </pic:pic>
+              </a:graphicData>
+            </a:graphic>
+          </wp:inline>
+        </w:drawing>
+      </w:r>
+    </w:p>
+    <w:p>
+      <w:pPr>
+        <w:spacing w:after="160" w:line="240"/>
+        <w:jc w:val="both"/>
+      </w:pPr>
+      <w:r>
+        <w:rPr>
+          <w:b/>
+          <w:bCs/>
+          <w:sz w:val="18"/>
+          <w:szCs w:val="18"/>
+        </w:rPr>
+        <w:t>Fig. 10. System &amp; speed panel during a MobileNetV3 fine-tune: elapsed time, ETA, step time, throughput, CPU, RAM, script and CUDA memory, and per-GPU load, memory, temperature and power, charted over logged steps.</w:t>
+      </w:r>
+    </w:p>
+    <w:p>
+      <w:pPr>
+        <w:pStyle w:val="Heading2"/>
+        <w:keepNext/>
+        <w:spacing w:after="60" w:before="140"/>
+      </w:pPr>
+      <w:r>
+        <w:t>D. Where this is useful</w:t>
+      </w:r>
+    </w:p>
+    <w:p>
+      <w:pPr>
+        <w:spacing w:after="80" w:line="264"/>
+        <w:ind w:firstLine="284"/>
+        <w:jc w:val="both"/>
+      </w:pPr>
+      <w:r>
+        <w:t>The same measurements answer practical questions. For deployment, they show which models fit a budget: MobileNetV3 or ResNet-18 run in 2–5 ms per image on a laptop CPU through ONNX Runtime, while ViT-B/16 and 3D CNNs need a GPU. For transfer learning, live train-versus-test curves, update ratios and dead-unit alerts catch configuration errors such as the BatchNorm momentum above early rather than after a run. For performance, GPU-idle and memory alerts, throughput and ETA show whether the data pipeline or the model is the bottleneck and whether a change helped. For explanation and teaching, feature maps on a real photo and per-head attention show what a CNN or a transformer responds to, and importing an export and comparing its top classes verifies that a deployed model is the trained one. The 5D view extends this to video and volumetric (for example CT or MRI) models.</w:t>
+      </w:r>
+    </w:p>
+    <w:p>
+      <w:pPr>
+        <w:pStyle w:val="Heading1"/>
+        <w:keepNext/>
+        <w:spacing w:after="120" w:before="240"/>
+        <w:jc w:val="center"/>
+      </w:pPr>
+      <w:r>
+        <w:t>XI. Limitations and Future Work</w:t>
       </w:r>
     </w:p>
     <w:p>
@@ -6824,7 +10413,7 @@
         <w:t xml:space="preserve">Scale of graphs.</w:t>
       </w:r>
       <w:r>
-        <w:t xml:space="preserve"> Imported graphs with hundreds of operators render as blocks without grouping by module, and subgraphs are not expanded.</w:t>
+        <w:t xml:space="preserve"> Long operator chains wrap into rows and constants are placed beside their consumers, so a 1,016-operator ViT fits one screen, but operators are not yet grouped by module, subgraphs are not expanded, and above 200 operators intermediate values are kept only for operators the user asks for.</w:t>
       </w:r>
     </w:p>
     <w:p>
@@ -6850,6 +10439,27 @@
     </w:p>
     <w:p>
       <w:pPr>
+        <w:pStyle w:val="ListParagraph"/>
+        <w:numPr>
+          <w:ilvl w:val="0"/>
+          <w:numId w:val="3"/>
+        </w:numPr>
+        <w:spacing w:after="40" w:line="264"/>
+        <w:jc w:val="both"/>
+      </w:pPr>
+      <w:r>
+        <w:rPr>
+          <w:b/>
+          <w:bCs/>
+        </w:rPr>
+        <w:t>Self-reported telemetry.</w:t>
+      </w:r>
+      <w:r>
+        <w:t xml:space="preserve"> System figures come from the training script's own process; NVML utilization is the share of time a kernel ran, not how much of the GPU it used, and GPU memory includes other processes. Per-layer health collection costs speed (20–30% when collected every four batches).</w:t>
+      </w:r>
+    </w:p>
+    <w:p>
+      <w:pPr>
         <w:spacing w:after="80" w:line="264"/>
         <w:ind w:firstLine="284"/>
         <w:jc w:val="both"/>
@@ -6866,7 +10476,7 @@
         <w:jc w:val="center"/>
       </w:pPr>
       <w:r>
-        <w:t xml:space="preserve">XI. Conclusion</w:t>
+        <w:t>XII. Conclusion</w:t>
       </w:r>
     </w:p>
     <w:p>
@@ -6886,7 +10496,7 @@
         <w:jc w:val="both"/>
       </w:pPr>
       <w:r>
-        <w:t xml:space="preserve">The implementation reproduces PyTorch's outputs to 5.2 × 10⁻⁸ through ONNX, recovers attention heads from a standard PyTorch export, trains toy tasks to 100% validation accuracy in seconds on a CPU, and answers typical requests in milliseconds. The source code, design records and documentation are available at https://github.com/vishwa-10147/neurovision.</w:t>
+        <w:t>The implementation reproduces PyTorch's outputs to 5.2 × 10⁻⁸ through ONNX, recovers attention heads from a standard PyTorch export, trains toy tasks to 100% validation accuracy in seconds on a CPU, and answers typical requests in milliseconds. With real pretrained models it imports a 331 MB ViT-B/16 in about 4 s, shows its feature maps and attention on a real photo, and streams GPU fine-tuning with live system load and ETA, which made a model-specific BatchNorm problem visible within the first epochs. The source code, design records and documentation are available at https://github.com/vishwa-10147/neurovision.</w:t>
       </w:r>
     </w:p>
     <w:p>
@@ -6914,7 +10524,9 @@
           <w:sz w:val="17"/>
           <w:szCs w:val="17"/>
         </w:rPr>
-        <w:t xml:space="preserve">[1]	D. Smilkov, S. Carter, D. Sculley, F. B. Viégas, and M. Wattenberg, "Direct-manipulation visualization of deep networks," in ICML Workshop on Visualization for Deep Learning, 2016.</w:t>
+        <w:t>[1]</w:t>
+        <w:tab/>
+        <w:t>ONNX Runtime Developers, "ONNX Runtime: Cross-platform, high performance ML inferencing and training accelerator," software, v1.31, 2026. [Online]. Available: https://onnxruntime.ai</w:t>
       </w:r>
     </w:p>
     <w:p>
@@ -6931,7 +10543,9 @@
           <w:sz w:val="17"/>
           <w:szCs w:val="17"/>
         </w:rPr>
-        <w:t xml:space="preserve">[2]	Z. J. Wang, R. Turko, O. Shaikh, H. Park, N. Das, F. Hohman, M. Kahng, and D. H. Chau, "CNN Explainer: Learning convolutional neural networks with interactive visualization," IEEE Trans. Vis. Comput. Graphics, vol. 27, no. 2, pp. 1396–1406, 2021.</w:t>
+        <w:t>[2]</w:t>
+        <w:tab/>
+        <w:t>ONNX Project Contributors, "Open Neural Network Exchange (ONNX)," software and specification, v1.23, 2026. [Online]. Available: https://onnx.ai</w:t>
       </w:r>
     </w:p>
     <w:p>
@@ -6948,7 +10562,9 @@
           <w:sz w:val="17"/>
           <w:szCs w:val="17"/>
         </w:rPr>
-        <w:t xml:space="preserve">[3]	L. Roeder, "Netron: Visualizer for neural network, deep learning and machine learning models," software, https://github.com/lutzroeder/netron.</w:t>
+        <w:t>[3]</w:t>
+        <w:tab/>
+        <w:t>R. Cabello et al., "Three.js: JavaScript 3D library," software, r186, 2026, https://threejs.org; Poimandres, "React Three Fiber," software, v9.8, 2026, https://github.com/pmndrs/react-three-fiber.</w:t>
       </w:r>
     </w:p>
     <w:p>
@@ -6965,7 +10581,9 @@
           <w:sz w:val="17"/>
           <w:szCs w:val="17"/>
         </w:rPr>
-        <w:t xml:space="preserve">[4]	K. Wongsuphasawat, D. Smilkov, J. Wexler, J. Wilson, D. Mané, D. Fritz, D. Krishnan, F. B. Viégas, and M. Wattenberg, "Visualizing dataflow graphs of deep learning models in TensorFlow," IEEE Trans. Vis. Comput. Graphics, vol. 24, no. 1, pp. 1–12, 2018.</w:t>
+        <w:t>[4]</w:t>
+        <w:tab/>
+        <w:t>L. Roeder, "Netron: Visualizer for neural network, deep learning and machine learning models," software, accessed Oct. 2026. [Online]. Available: https://github.com/lutzroeder/netron</w:t>
       </w:r>
     </w:p>
     <w:p>
@@ -6982,7 +10600,9 @@
           <w:sz w:val="17"/>
           <w:szCs w:val="17"/>
         </w:rPr>
-        <w:t xml:space="preserve">[5]	J. Vig, "A multiscale visualization of attention in the Transformer model," in Proc. 57th Annu. Meeting Assoc. Comput. Linguistics: System Demonstrations, 2019, pp. 37–42.</w:t>
+        <w:t>[5]</w:t>
+        <w:tab/>
+        <w:t>Z. Liu, H. Mao, C.-Y. Wu, C. Feichtenhofer, T. Darrell, and S. Xie, "A ConvNet for the 2020s," in Proc. IEEE/CVF Conf. Computer Vision and Pattern Recognition (CVPR), 2022, pp. 11976–11986.</w:t>
       </w:r>
     </w:p>
     <w:p>
@@ -6999,7 +10619,9 @@
           <w:sz w:val="17"/>
           <w:szCs w:val="17"/>
         </w:rPr>
-        <w:t xml:space="preserve">[6]	ONNX Project Contributors, "Open Neural Network Exchange (ONNX)," software and specification, https://onnx.ai.</w:t>
+        <w:t>[6]</w:t>
+        <w:tab/>
+        <w:t>Z. J. Wang, R. Turko, O. Shaikh, H. Park, N. Das, F. Hohman, M. Kahng, and D. H. Chau, "CNN Explainer: Learning convolutional neural networks with interactive visualization," IEEE Trans. Vis. Comput. Graphics, vol. 27, no. 2, pp. 1396–1406, 2021.</w:t>
       </w:r>
     </w:p>
     <w:p>
@@ -7016,7 +10638,9 @@
           <w:sz w:val="17"/>
           <w:szCs w:val="17"/>
         </w:rPr>
-        <w:t xml:space="preserve">[7]	M. Abadi et al., "TensorFlow: A system for large-scale machine learning," in Proc. 12th USENIX Symp. Operating Systems Design and Implementation (OSDI), 2016, pp. 265–283.</w:t>
+        <w:t>[7]</w:t>
+        <w:tab/>
+        <w:t>A. Dosovitskiy, L. Beyer, A. Kolesnikov, D. Weissenborn, X. Zhai, T. Unterthiner, M. Dehghani, M. Minderer, G. Heigold, S. Gelly, J. Uszkoreit, and N. Houlsby, "An image is worth 16x16 words: Transformers for image recognition at scale," in Proc. Int. Conf. Learning Representations (ICLR), 2021.</w:t>
       </w:r>
     </w:p>
     <w:p>
@@ -7033,7 +10657,9 @@
           <w:sz w:val="17"/>
           <w:szCs w:val="17"/>
         </w:rPr>
-        <w:t xml:space="preserve">[8]	L. Biewald, "Experiment tracking with Weights and Biases," software, https://wandb.ai, 2020.</w:t>
+        <w:t>[8]</w:t>
+        <w:tab/>
+        <w:t>L. Biewald, "Experiment tracking with Weights and Biases," software, https://wandb.ai, 2020.</w:t>
       </w:r>
     </w:p>
     <w:p>
@@ -7050,7 +10676,9 @@
           <w:sz w:val="17"/>
           <w:szCs w:val="17"/>
         </w:rPr>
-        <w:t xml:space="preserve">[9]	M. D. Zeiler and R. Fergus, "Visualizing and understanding convolutional networks," in Proc. European Conf. Computer Vision (ECCV), 2014, pp. 818–833.</w:t>
+        <w:t>[9]</w:t>
+        <w:tab/>
+        <w:t>F. Hohman, M. Kahng, R. Pienta, and D. H. Chau, "Visual analytics in deep learning: An interrogative survey for the next frontiers," IEEE Trans. Vis. Comput. Graphics, vol. 25, no. 8, pp. 2674–2693, 2019.</w:t>
       </w:r>
     </w:p>
     <w:p>
@@ -7067,7 +10695,9 @@
           <w:sz w:val="17"/>
           <w:szCs w:val="17"/>
         </w:rPr>
-        <w:t xml:space="preserve">[10]	A. Vaswani, N. Shazeer, N. Parmar, J. Uszkoreit, L. Jones, A. N. Gomez, Ł. Kaiser, and I. Polosukhin, "Attention is all you need," in Advances in Neural Information Processing Systems (NeurIPS), 2017, pp. 5998–6008.</w:t>
+        <w:t>[10]</w:t>
+        <w:tab/>
+        <w:t>J. Vig, "A multiscale visualization of attention in the Transformer model," in Proc. 57th Annu. Meeting Assoc. Comput. Linguistics: System Demonstrations, 2019, pp. 37–42.</w:t>
       </w:r>
     </w:p>
     <w:p>
@@ -7084,7 +10714,9 @@
           <w:sz w:val="17"/>
           <w:szCs w:val="17"/>
         </w:rPr>
-        <w:t xml:space="preserve">[11]	F. Hohman, M. Kahng, R. Pienta, and D. H. Chau, "Visual analytics in deep learning: An interrogative survey for the next frontiers," IEEE Trans. Vis. Comput. Graphics, vol. 25, no. 8, pp. 2674–2693, 2019.</w:t>
+        <w:t>[11]</w:t>
+        <w:tab/>
+        <w:t>A. Paszke et al., "PyTorch: An imperative style, high-performance deep learning library," in Advances in Neural Information Processing Systems (NeurIPS), 2019, pp. 8024–8035.</w:t>
       </w:r>
     </w:p>
     <w:p>
@@ -7101,7 +10733,9 @@
           <w:sz w:val="17"/>
           <w:szCs w:val="17"/>
         </w:rPr>
-        <w:t xml:space="preserve">[12]	R. Cabello et al., "Three.js: JavaScript 3D library," software, https://threejs.org; Poimandres, "React Three Fiber," software, https://github.com/pmndrs/react-three-fiber.</w:t>
+        <w:t>[12]</w:t>
+        <w:tab/>
+        <w:t>A. Howard, M. Sandler, G. Chu, L.-C. Chen, B. Chen, M. Tan, W. Wang, Y. Zhu, R. Pang, V. Vasudevan, Q. V. Le, and H. Adam, "Searching for MobileNetV3," in Proc. IEEE/CVF Int. Conf. Computer Vision (ICCV), 2019, pp. 1314–1324.</w:t>
       </w:r>
     </w:p>
     <w:p>
@@ -7118,7 +10752,9 @@
           <w:sz w:val="17"/>
           <w:szCs w:val="17"/>
         </w:rPr>
-        <w:t xml:space="preserve">[13]	A. Paszke et al., "PyTorch: An imperative style, high-performance deep learning library," in Advances in Neural Information Processing Systems (NeurIPS), 2019, pp. 8024–8035.</w:t>
+        <w:t>[13]</w:t>
+        <w:tab/>
+        <w:t>K. Wongsuphasawat, D. Smilkov, J. Wexler, J. Wilson, D. Mané, D. Fritz, D. Krishnan, F. B. Viégas, and M. Wattenberg, "Visualizing dataflow graphs of deep learning models in TensorFlow," IEEE Trans. Vis. Comput. Graphics, vol. 24, no. 1, pp. 1–12, 2018.</w:t>
       </w:r>
     </w:p>
     <w:p>
@@ -7135,7 +10771,123 @@
           <w:sz w:val="17"/>
           <w:szCs w:val="17"/>
         </w:rPr>
-        <w:t xml:space="preserve">[14]	ONNX Runtime Developers, "ONNX Runtime: Cross-platform, high performance ML inferencing and training accelerator," software, https://onnxruntime.ai.</w:t>
+        <w:t>[14]</w:t>
+        <w:tab/>
+        <w:t>D. Tran, H. Wang, L. Torresani, J. Ray, Y. LeCun, and M. Paluri, "A closer look at spatiotemporal convolutions for action recognition," in Proc. IEEE/CVF Conf. Computer Vision and Pattern Recognition (CVPR), 2018, pp. 6450–6459.</w:t>
+      </w:r>
+    </w:p>
+    <w:p>
+      <w:pPr>
+        <w:tabs>
+          <w:tab w:val="left" w:pos="440"/>
+        </w:tabs>
+        <w:spacing w:after="50" w:line="230"/>
+        <w:ind w:left="440" w:hanging="440"/>
+        <w:jc w:val="both"/>
+      </w:pPr>
+      <w:r>
+        <w:rPr>
+          <w:sz w:val="17"/>
+          <w:szCs w:val="17"/>
+        </w:rPr>
+        <w:t>[15]</w:t>
+        <w:tab/>
+        <w:t>A. Vaswani, N. Shazeer, N. Parmar, J. Uszkoreit, L. Jones, A. N. Gomez, Ł. Kaiser, and I. Polosukhin, "Attention is all you need," in Advances in Neural Information Processing Systems (NeurIPS), 2017, pp. 5998–6008.</w:t>
+      </w:r>
+    </w:p>
+    <w:p>
+      <w:pPr>
+        <w:tabs>
+          <w:tab w:val="left" w:pos="440"/>
+        </w:tabs>
+        <w:spacing w:after="50" w:line="230"/>
+        <w:ind w:left="440" w:hanging="440"/>
+        <w:jc w:val="both"/>
+      </w:pPr>
+      <w:r>
+        <w:rPr>
+          <w:sz w:val="17"/>
+          <w:szCs w:val="17"/>
+        </w:rPr>
+        <w:t>[16]</w:t>
+        <w:tab/>
+        <w:t>D. Smilkov, S. Carter, D. Sculley, F. B. Viégas, and M. Wattenberg, "Direct-manipulation visualization of deep networks," in ICML Workshop on Visualization for Deep Learning, 2016.</w:t>
+      </w:r>
+    </w:p>
+    <w:p>
+      <w:pPr>
+        <w:tabs>
+          <w:tab w:val="left" w:pos="440"/>
+        </w:tabs>
+        <w:spacing w:after="50" w:line="230"/>
+        <w:ind w:left="440" w:hanging="440"/>
+        <w:jc w:val="both"/>
+      </w:pPr>
+      <w:r>
+        <w:rPr>
+          <w:sz w:val="17"/>
+          <w:szCs w:val="17"/>
+        </w:rPr>
+        <w:t>[17]</w:t>
+        <w:tab/>
+        <w:t>M. Abadi et al., "TensorFlow: A system for large-scale machine learning," in Proc. 12th USENIX Symp. Operating Systems Design and Implementation (OSDI), 2016, pp. 265–283.</w:t>
+      </w:r>
+    </w:p>
+    <w:p>
+      <w:pPr>
+        <w:tabs>
+          <w:tab w:val="left" w:pos="440"/>
+        </w:tabs>
+        <w:spacing w:after="50" w:line="230"/>
+        <w:ind w:left="440" w:hanging="440"/>
+        <w:jc w:val="both"/>
+      </w:pPr>
+      <w:r>
+        <w:rPr>
+          <w:sz w:val="17"/>
+          <w:szCs w:val="17"/>
+        </w:rPr>
+        <w:t>[18]</w:t>
+        <w:tab/>
+        <w:t>K. He, X. Zhang, S. Ren, and J. Sun, "Deep residual learning for image recognition," in Proc. IEEE Conf. Computer Vision and Pattern Recognition (CVPR), 2016, pp. 770–778.</w:t>
+      </w:r>
+    </w:p>
+    <w:p>
+      <w:pPr>
+        <w:tabs>
+          <w:tab w:val="left" w:pos="440"/>
+        </w:tabs>
+        <w:spacing w:after="50" w:line="230"/>
+        <w:ind w:left="440" w:hanging="440"/>
+        <w:jc w:val="both"/>
+      </w:pPr>
+      <w:r>
+        <w:rPr>
+          <w:sz w:val="17"/>
+          <w:szCs w:val="17"/>
+        </w:rPr>
+        <w:t>[19]</w:t>
+        <w:tab/>
+        <w:t>S. Ioffe and C. Szegedy, "Batch normalization: Accelerating deep network training by reducing internal covariate shift," in Proc. 32nd Int. Conf. Machine Learning (ICML), 2015, pp. 448–456.</w:t>
+      </w:r>
+    </w:p>
+    <w:p>
+      <w:pPr>
+        <w:tabs>
+          <w:tab w:val="left" w:pos="440"/>
+        </w:tabs>
+        <w:spacing w:after="50" w:line="230"/>
+        <w:ind w:left="440" w:hanging="440"/>
+        <w:jc w:val="both"/>
+      </w:pPr>
+      <w:r>
+        <w:rPr>
+          <w:sz w:val="17"/>
+          <w:szCs w:val="17"/>
+        </w:rPr>
+        <w:t>[20]</w:t>
+        <w:tab/>
+        <w:t>M. D. Zeiler and R. Fergus, "Visualizing and understanding convolutional networks," in Proc. European Conf. Computer Vision (ECCV), 2014, pp. 818–833.</w:t>
       </w:r>
     </w:p>
     <w:sectPr>

</xml_diff>